<commit_message>
UNST-9576: Updated: 2 doc files
</commit_message>
<xml_diff>
--- a/src/tools_gpl/csumo_precice/docs/design_questions.docx
+++ b/src/tools_gpl/csumo_precice/docs/design_questions.docx
@@ -4,63 +4,63 @@
   <w:body>
     <w:p>
       <w:pPr>
-        <w:rPr>
-          <w:lang w:val="en-GB"/>
-        </w:rPr>
-      </w:pPr>
-      <w:r>
-        <w:rPr>
-          <w:lang w:val="en-GB"/>
-        </w:rPr>
-        <w:t>D-Flow FM – C-</w:t>
-      </w:r>
-      <w:proofErr w:type="spellStart"/>
-      <w:r>
-        <w:rPr>
-          <w:lang w:val="en-GB"/>
-        </w:rPr>
-        <w:t>SUMO_</w:t>
-      </w:r>
-      <w:r>
-        <w:rPr>
-          <w:lang w:val="en-GB"/>
-        </w:rPr>
-        <w:t>precice</w:t>
-      </w:r>
-      <w:proofErr w:type="spellEnd"/>
-      <w:r>
-        <w:rPr>
-          <w:lang w:val="en-GB"/>
-        </w:rPr>
-        <w:t xml:space="preserve"> – C-SUMO</w:t>
-      </w:r>
-    </w:p>
-    <w:p>
-      <w:pPr>
-        <w:rPr>
-          <w:lang w:val="en-GB"/>
-        </w:rPr>
-      </w:pPr>
-    </w:p>
-    <w:p>
-      <w:pPr>
-        <w:rPr>
-          <w:lang w:val="en-GB"/>
-        </w:rPr>
-      </w:pPr>
-      <w:proofErr w:type="spellStart"/>
-      <w:r>
-        <w:rPr>
-          <w:lang w:val="en-GB"/>
-        </w:rPr>
-        <w:t>QandA</w:t>
-      </w:r>
-      <w:proofErr w:type="spellEnd"/>
-      <w:r>
-        <w:rPr>
-          <w:lang w:val="en-GB"/>
-        </w:rPr>
-        <w:t xml:space="preserve"> Wilbert:</w:t>
+        <w:pStyle w:val="Heading1"/>
+        <w:rPr>
+          <w:lang w:val="en-GB"/>
+        </w:rPr>
+      </w:pPr>
+      <w:r>
+        <w:rPr>
+          <w:lang w:val="en-GB"/>
+        </w:rPr>
+        <w:t>D-Flow FM – C-SUMO_</w:t>
+      </w:r>
+      <w:r>
+        <w:rPr>
+          <w:lang w:val="en-GB"/>
+        </w:rPr>
+        <w:t>precice – C-SUMO</w:t>
+      </w:r>
+    </w:p>
+    <w:p>
+      <w:pPr>
+        <w:pStyle w:val="Heading1"/>
+        <w:rPr>
+          <w:lang w:val="en-GB"/>
+        </w:rPr>
+      </w:pPr>
+      <w:r>
+        <w:rPr>
+          <w:lang w:val="en-GB"/>
+        </w:rPr>
+        <w:t>Introduction</w:t>
+      </w:r>
+    </w:p>
+    <w:p>
+      <w:pPr>
+        <w:rPr>
+          <w:lang w:val="en-GB"/>
+        </w:rPr>
+      </w:pPr>
+      <w:r>
+        <w:rPr>
+          <w:lang w:val="en-GB"/>
+        </w:rPr>
+        <w:t xml:space="preserve">We’re designing the communication between D-Flow FM and the C-SUMO_preCICE wrapper. We intent to keep the interface as clean/generic as possible and are thinking about moving code (desa-routine) from D-Flow FM to C-SUMO_preCICE. </w:t>
+      </w:r>
+    </w:p>
+    <w:p>
+      <w:pPr>
+        <w:pStyle w:val="Heading1"/>
+        <w:rPr>
+          <w:lang w:val="en-GB"/>
+        </w:rPr>
+      </w:pPr>
+      <w:r>
+        <w:rPr>
+          <w:lang w:val="en-GB"/>
+        </w:rPr>
+        <w:t>QandA Wilbert</w:t>
       </w:r>
     </w:p>
     <w:p>
@@ -83,21 +83,7 @@
         <w:rPr>
           <w:lang w:val="en-GB"/>
         </w:rPr>
-        <w:t xml:space="preserve">Must the DIMR coupling still work when the </w:t>
-      </w:r>
-      <w:proofErr w:type="spellStart"/>
-      <w:r>
-        <w:rPr>
-          <w:lang w:val="en-GB"/>
-        </w:rPr>
-        <w:t>preCICE</w:t>
-      </w:r>
-      <w:proofErr w:type="spellEnd"/>
-      <w:r>
-        <w:rPr>
-          <w:lang w:val="en-GB"/>
-        </w:rPr>
-        <w:t xml:space="preserve"> coupling is added?</w:t>
+        <w:t>Must the DIMR coupling still work when the preCICE coupling is added?</w:t>
       </w:r>
       <w:r>
         <w:rPr>
@@ -117,21 +103,7 @@
         <w:rPr>
           <w:lang w:val="en-GB"/>
         </w:rPr>
-        <w:t xml:space="preserve">If the </w:t>
-      </w:r>
-      <w:proofErr w:type="spellStart"/>
-      <w:r>
-        <w:rPr>
-          <w:lang w:val="en-GB"/>
-        </w:rPr>
-        <w:t>preCICE</w:t>
-      </w:r>
-      <w:proofErr w:type="spellEnd"/>
-      <w:r>
-        <w:rPr>
-          <w:lang w:val="en-GB"/>
-        </w:rPr>
-        <w:t xml:space="preserve"> coupling can be used, then the DIMR coupling is not needed anymore.</w:t>
+        <w:t>If the preCICE coupling can be used, then the DIMR coupling is not needed anymore.</w:t>
       </w:r>
     </w:p>
     <w:p>
@@ -214,35 +186,7 @@
         <w:rPr>
           <w:lang w:val="en-GB"/>
         </w:rPr>
-        <w:t xml:space="preserve">Above </w:t>
-      </w:r>
-      <w:proofErr w:type="spellStart"/>
-      <w:r>
-        <w:rPr>
-          <w:lang w:val="en-GB"/>
-        </w:rPr>
-        <w:t>waterlevel</w:t>
-      </w:r>
-      <w:proofErr w:type="spellEnd"/>
-      <w:r>
-        <w:rPr>
-          <w:lang w:val="en-GB"/>
-        </w:rPr>
-        <w:t xml:space="preserve"> or below </w:t>
-      </w:r>
-      <w:proofErr w:type="spellStart"/>
-      <w:r>
-        <w:rPr>
-          <w:lang w:val="en-GB"/>
-        </w:rPr>
-        <w:t>bedlevel</w:t>
-      </w:r>
-      <w:proofErr w:type="spellEnd"/>
-      <w:r>
-        <w:rPr>
-          <w:lang w:val="en-GB"/>
-        </w:rPr>
-        <w:t xml:space="preserve">: handled by FM (no changes). </w:t>
+        <w:t xml:space="preserve">Above waterlevel or below bedlevel: handled by FM (no changes). </w:t>
       </w:r>
       <w:r>
         <w:rPr>
@@ -262,122 +206,22 @@
         <w:rPr>
           <w:lang w:val="en-GB"/>
         </w:rPr>
-        <w:t xml:space="preserve">Sources/sinks should NOT be neglected when they are completely below </w:t>
-      </w:r>
-      <w:proofErr w:type="spellStart"/>
-      <w:r>
-        <w:rPr>
-          <w:lang w:val="en-GB"/>
-        </w:rPr>
-        <w:t>bedlevel</w:t>
-      </w:r>
-      <w:proofErr w:type="spellEnd"/>
-      <w:r>
-        <w:rPr>
-          <w:lang w:val="en-GB"/>
-        </w:rPr>
-        <w:t xml:space="preserve"> or completely above </w:t>
-      </w:r>
-      <w:proofErr w:type="spellStart"/>
-      <w:r>
-        <w:rPr>
-          <w:lang w:val="en-GB"/>
-        </w:rPr>
-        <w:t>waterlevel</w:t>
-      </w:r>
-      <w:proofErr w:type="spellEnd"/>
-      <w:r>
-        <w:rPr>
-          <w:lang w:val="en-GB"/>
-        </w:rPr>
-        <w:t>. So please add:</w:t>
-      </w:r>
-      <w:r>
-        <w:rPr>
-          <w:lang w:val="en-GB"/>
-        </w:rPr>
-        <w:br/>
-        <w:t xml:space="preserve">IF </w:t>
-      </w:r>
-      <w:proofErr w:type="spellStart"/>
-      <w:r>
-        <w:rPr>
-          <w:lang w:val="en-GB"/>
-        </w:rPr>
-        <w:t>z_max</w:t>
-      </w:r>
-      <w:proofErr w:type="spellEnd"/>
-      <w:r>
-        <w:rPr>
-          <w:lang w:val="en-GB"/>
-        </w:rPr>
-        <w:t xml:space="preserve"> &lt; </w:t>
-      </w:r>
-      <w:proofErr w:type="spellStart"/>
-      <w:r>
-        <w:rPr>
-          <w:lang w:val="en-GB"/>
-        </w:rPr>
-        <w:t>bedlevel</w:t>
-      </w:r>
-      <w:proofErr w:type="spellEnd"/>
-      <w:r>
-        <w:rPr>
-          <w:lang w:val="en-GB"/>
-        </w:rPr>
-        <w:t xml:space="preserve"> THEN </w:t>
-      </w:r>
-      <w:proofErr w:type="spellStart"/>
-      <w:r>
-        <w:rPr>
-          <w:lang w:val="en-GB"/>
-        </w:rPr>
-        <w:t>errormessage_and_stop</w:t>
-      </w:r>
-      <w:proofErr w:type="spellEnd"/>
-      <w:r>
-        <w:rPr>
-          <w:lang w:val="en-GB"/>
-        </w:rPr>
-        <w:br/>
-        <w:t xml:space="preserve">IF </w:t>
-      </w:r>
-      <w:proofErr w:type="spellStart"/>
-      <w:r>
-        <w:rPr>
-          <w:lang w:val="en-GB"/>
-        </w:rPr>
-        <w:t>z_min</w:t>
-      </w:r>
-      <w:proofErr w:type="spellEnd"/>
-      <w:r>
-        <w:rPr>
-          <w:lang w:val="en-GB"/>
-        </w:rPr>
-        <w:t xml:space="preserve"> &gt; </w:t>
-      </w:r>
-      <w:proofErr w:type="spellStart"/>
-      <w:r>
-        <w:rPr>
-          <w:lang w:val="en-GB"/>
-        </w:rPr>
-        <w:t>waterlevel</w:t>
-      </w:r>
-      <w:proofErr w:type="spellEnd"/>
-      <w:r>
-        <w:rPr>
-          <w:lang w:val="en-GB"/>
-        </w:rPr>
-        <w:t xml:space="preserve"> THEN </w:t>
-      </w:r>
-      <w:proofErr w:type="spellStart"/>
-      <w:r>
-        <w:rPr>
-          <w:lang w:val="en-GB"/>
-        </w:rPr>
-        <w:t>errormessage_and_stop</w:t>
-      </w:r>
-      <w:proofErr w:type="spellEnd"/>
+        <w:t>Sources/sinks should NOT be neglected when they are completely below bedlevel or completely above waterlevel. So please add:</w:t>
+      </w:r>
+      <w:r>
+        <w:rPr>
+          <w:lang w:val="en-GB"/>
+        </w:rPr>
+        <w:br/>
+        <w:t>IF z_max &lt; bedlevel THEN errormessage_and_stop</w:t>
+      </w:r>
+      <w:r>
+        <w:rPr>
+          <w:lang w:val="en-GB"/>
+        </w:rPr>
+        <w:br/>
+        <w:t>IF z_min &gt; waterlevel THEN errormessage_and_stop</w:t>
+      </w:r>
     </w:p>
     <w:p>
       <w:pPr>
@@ -401,21 +245,7 @@
         <w:rPr>
           <w:lang w:val="en-GB"/>
         </w:rPr>
-        <w:t>How important is "</w:t>
-      </w:r>
-      <w:proofErr w:type="spellStart"/>
-      <w:r>
-        <w:rPr>
-          <w:lang w:val="en-GB"/>
-        </w:rPr>
-        <w:t>check_mixed_source_sink</w:t>
-      </w:r>
-      <w:proofErr w:type="spellEnd"/>
-      <w:r>
-        <w:rPr>
-          <w:lang w:val="en-GB"/>
-        </w:rPr>
-        <w:t>"?</w:t>
+        <w:t>How important is "check_mixed_source_sink"?</w:t>
       </w:r>
       <w:r>
         <w:rPr>
@@ -473,48 +303,26 @@
         <w:rPr>
           <w:lang w:val="en-GB"/>
         </w:rPr>
-        <w:t xml:space="preserve">Discharge and </w:t>
-      </w:r>
-      <w:proofErr w:type="spellStart"/>
-      <w:r>
-        <w:rPr>
-          <w:lang w:val="en-GB"/>
-        </w:rPr>
-        <w:t>const_excess</w:t>
-      </w:r>
-      <w:proofErr w:type="spellEnd"/>
-      <w:r>
-        <w:rPr>
-          <w:lang w:val="en-GB"/>
-        </w:rPr>
-        <w:t>: why is the base value averaged over intake locations of all diffusors?</w:t>
-      </w:r>
-      <w:r>
-        <w:rPr>
-          <w:lang w:val="en-GB"/>
-        </w:rPr>
-        <w:br/>
+        <w:t>Discharge and const_excess: why is the base value averaged over intake locations of all diffusors?</w:t>
+      </w:r>
+      <w:r>
+        <w:rPr>
+          <w:lang w:val="en-GB"/>
+        </w:rPr>
+        <w:br/>
+      </w:r>
+      <w:r>
+        <w:rPr>
+          <w:lang w:val="en-GB"/>
+        </w:rPr>
+        <w:lastRenderedPageBreak/>
         <w:t xml:space="preserve">A: </w:t>
       </w:r>
       <w:r>
         <w:rPr>
           <w:lang w:val="en-GB"/>
         </w:rPr>
-        <w:t xml:space="preserve">That is wrong: the base value to use in case of </w:t>
-      </w:r>
-      <w:proofErr w:type="spellStart"/>
-      <w:r>
-        <w:rPr>
-          <w:lang w:val="en-GB"/>
-        </w:rPr>
-        <w:t>const_excess</w:t>
-      </w:r>
-      <w:proofErr w:type="spellEnd"/>
-      <w:r>
-        <w:rPr>
-          <w:lang w:val="en-GB"/>
-        </w:rPr>
-        <w:t xml:space="preserve"> is just the intake location of the current diffusor only.</w:t>
+        <w:t>That is wrong: the base value to use in case of const_excess is just the intake location of the current diffusor only.</w:t>
       </w:r>
     </w:p>
     <w:p>
@@ -581,7 +389,6 @@
         <w:rPr>
           <w:lang w:val="en-GB"/>
         </w:rPr>
-        <w:lastRenderedPageBreak/>
         <w:t xml:space="preserve">Q: </w:t>
       </w:r>
       <w:r>
@@ -624,42 +431,14 @@
         <w:rPr>
           <w:lang w:val="en-GB"/>
         </w:rPr>
-        <w:t xml:space="preserve">Q: What is C-SUMO doing with the </w:t>
-      </w:r>
-      <w:proofErr w:type="spellStart"/>
-      <w:r>
-        <w:rPr>
-          <w:lang w:val="en-GB"/>
-        </w:rPr>
-        <w:t>mdu</w:t>
-      </w:r>
-      <w:proofErr w:type="spellEnd"/>
-      <w:r>
-        <w:rPr>
-          <w:lang w:val="en-GB"/>
-        </w:rPr>
-        <w:t>-file?</w:t>
-      </w:r>
-      <w:r>
-        <w:rPr>
-          <w:lang w:val="en-GB"/>
-        </w:rPr>
-        <w:br/>
-        <w:t xml:space="preserve">Why is the </w:t>
-      </w:r>
-      <w:proofErr w:type="spellStart"/>
-      <w:r>
-        <w:rPr>
-          <w:lang w:val="en-GB"/>
-        </w:rPr>
-        <w:t>mdu</w:t>
-      </w:r>
-      <w:proofErr w:type="spellEnd"/>
-      <w:r>
-        <w:rPr>
-          <w:lang w:val="en-GB"/>
-        </w:rPr>
-        <w:t>-file specified in the FF2NF file?</w:t>
+        <w:t>Q: What is C-SUMO doing with the mdu-file?</w:t>
+      </w:r>
+      <w:r>
+        <w:rPr>
+          <w:lang w:val="en-GB"/>
+        </w:rPr>
+        <w:br/>
+        <w:t>Why is the mdu-file specified in the FF2NF file?</w:t>
       </w:r>
       <w:r>
         <w:rPr>
@@ -702,21 +481,7 @@
         <w:rPr>
           <w:lang w:val="en-GB"/>
         </w:rPr>
-        <w:t>Is it allowed that C-</w:t>
-      </w:r>
-      <w:proofErr w:type="spellStart"/>
-      <w:r>
-        <w:rPr>
-          <w:lang w:val="en-GB"/>
-        </w:rPr>
-        <w:t>SUMO_preCICE</w:t>
-      </w:r>
-      <w:proofErr w:type="spellEnd"/>
-      <w:r>
-        <w:rPr>
-          <w:lang w:val="en-GB"/>
-        </w:rPr>
-        <w:t xml:space="preserve"> </w:t>
+        <w:t xml:space="preserve">Is it allowed that C-SUMO_preCICE </w:t>
       </w:r>
       <w:r>
         <w:rPr>
@@ -728,19 +493,32 @@
         <w:rPr>
           <w:lang w:val="en-GB"/>
         </w:rPr>
-        <w:t xml:space="preserve">writes instead of </w:t>
-      </w:r>
-      <w:r>
-        <w:rPr>
-          <w:lang w:val="en-GB"/>
-        </w:rPr>
-        <w:t xml:space="preserve">the actual </w:t>
+        <w:t xml:space="preserve">writes </w:t>
+      </w:r>
+      <w:r>
+        <w:rPr>
+          <w:lang w:val="en-GB"/>
+        </w:rPr>
+        <w:t>for t</w:t>
+      </w:r>
+      <w:r>
+        <w:rPr>
+          <w:lang w:val="en-GB"/>
+        </w:rPr>
+        <w:t xml:space="preserve">he </w:t>
       </w:r>
       <w:r>
         <w:rPr>
           <w:lang w:val="en-GB"/>
         </w:rPr>
         <w:t>constituent names: Temperature, Salinity, A, B, C, ...?</w:t>
+      </w:r>
+      <w:r>
+        <w:rPr>
+          <w:lang w:val="en-GB"/>
+        </w:rPr>
+        <w:br/>
+        <w:t>Passing through the actual names of all constituents works a bit awkward with preCICE.</w:t>
       </w:r>
       <w:r>
         <w:rPr>
@@ -881,19 +659,11 @@
         </w:rPr>
         <w:t xml:space="preserve"> is that </w:t>
       </w:r>
-      <w:proofErr w:type="spellStart"/>
-      <w:r>
-        <w:rPr>
-          <w:lang w:val="en-GB"/>
-        </w:rPr>
-        <w:t>preCICE</w:t>
-      </w:r>
-      <w:proofErr w:type="spellEnd"/>
-      <w:r>
-        <w:rPr>
-          <w:lang w:val="en-GB"/>
-        </w:rPr>
-        <w:t xml:space="preserve"> </w:t>
+      <w:r>
+        <w:rPr>
+          <w:lang w:val="en-GB"/>
+        </w:rPr>
+        <w:t xml:space="preserve">preCICE </w:t>
       </w:r>
       <w:r>
         <w:rPr>
@@ -911,47 +681,625 @@
         <w:rPr>
           <w:lang w:val="en-GB"/>
         </w:rPr>
-        <w:t xml:space="preserve"> from the D-Flow FM grid to these </w:t>
-      </w:r>
-      <w:proofErr w:type="spellStart"/>
-      <w:r>
-        <w:rPr>
-          <w:lang w:val="en-GB"/>
-        </w:rPr>
-        <w:t>xyz</w:t>
-      </w:r>
-      <w:proofErr w:type="spellEnd"/>
-      <w:r>
-        <w:rPr>
-          <w:lang w:val="en-GB"/>
-        </w:rPr>
-        <w:t>-locations.</w:t>
-      </w:r>
-    </w:p>
-    <w:p>
-      <w:pPr>
-        <w:ind w:left="720"/>
+        <w:t xml:space="preserve"> from the D-Flow FM grid to these xyz-locations.</w:t>
+      </w:r>
+      <w:r>
+        <w:rPr>
+          <w:lang w:val="en-GB"/>
+        </w:rPr>
+        <w:br/>
+      </w:r>
+      <w:r>
         <w:rPr>
           <w:b/>
           <w:bCs/>
           <w:lang w:val="en-GB"/>
         </w:rPr>
-      </w:pPr>
+        <w:t xml:space="preserve">A: </w:t>
+      </w:r>
+    </w:p>
+    <w:p>
+      <w:pPr>
+        <w:numPr>
+          <w:ilvl w:val="0"/>
+          <w:numId w:val="1"/>
+        </w:numPr>
+        <w:rPr>
+          <w:lang w:val="en-GB"/>
+        </w:rPr>
+      </w:pPr>
+      <w:r>
+        <w:rPr>
+          <w:lang w:val="en-GB"/>
+        </w:rPr>
+        <w:t xml:space="preserve">Q: </w:t>
+      </w:r>
+      <w:r>
+        <w:rPr>
+          <w:lang w:val="en-GB"/>
+        </w:rPr>
+        <w:t>Where is the DESA routine located</w:t>
+      </w:r>
+      <w:r>
+        <w:rPr>
+          <w:lang w:val="en-GB"/>
+        </w:rPr>
+        <w:t>?</w:t>
+      </w:r>
+      <w:r>
+        <w:rPr>
+          <w:lang w:val="en-GB"/>
+        </w:rPr>
+        <w:br/>
+        <w:t>The source code suggests that it’s inside Delft3D4-FLOW/D-Flow FM, while Roland’s PPT (22 April 2020) suggests it’s inside C-SUMO.</w:t>
+      </w:r>
+      <w:r>
+        <w:rPr>
+          <w:lang w:val="en-GB"/>
+        </w:rPr>
+        <w:br/>
+      </w:r>
       <w:r>
         <w:rPr>
           <w:b/>
           <w:bCs/>
           <w:lang w:val="en-GB"/>
         </w:rPr>
+        <w:t>A:</w:t>
+      </w:r>
+    </w:p>
+    <w:p>
+      <w:pPr>
+        <w:rPr>
+          <w:lang w:val="en-GB"/>
+        </w:rPr>
+      </w:pPr>
+    </w:p>
+    <w:p>
+      <w:pPr>
+        <w:rPr>
+          <w:lang w:val="en-GB"/>
+        </w:rPr>
+      </w:pPr>
+      <w:r>
+        <w:rPr>
+          <w:lang w:val="en-GB"/>
+        </w:rPr>
+        <w:br/>
+      </w:r>
+    </w:p>
+    <w:p>
+      <w:pPr>
+        <w:rPr>
+          <w:lang w:val="en-GB"/>
+        </w:rPr>
+      </w:pPr>
+      <w:r>
+        <w:rPr>
+          <w:lang w:val="en-GB"/>
+        </w:rPr>
+        <w:br w:type="page"/>
+      </w:r>
+    </w:p>
+    <w:p>
+      <w:pPr>
+        <w:pStyle w:val="Heading1"/>
+        <w:rPr>
+          <w:lang w:val="en-GB"/>
+        </w:rPr>
+      </w:pPr>
+      <w:r>
+        <w:rPr>
+          <w:lang w:val="en-GB"/>
+        </w:rPr>
+        <w:lastRenderedPageBreak/>
+        <w:t>QandA Arthur</w:t>
+      </w:r>
+    </w:p>
+    <w:p>
+      <w:pPr>
+        <w:numPr>
+          <w:ilvl w:val="0"/>
+          <w:numId w:val="5"/>
+        </w:numPr>
+        <w:rPr>
+          <w:lang w:val="en-GB"/>
+        </w:rPr>
+      </w:pPr>
+      <w:r>
+        <w:rPr>
+          <w:lang w:val="en-GB"/>
+        </w:rPr>
+        <w:t xml:space="preserve">Q: </w:t>
+      </w:r>
+      <w:r>
+        <w:rPr>
+          <w:lang w:val="en-GB"/>
+        </w:rPr>
+        <w:t xml:space="preserve">Are coupled source-sink locations handled correctly in D-Flow FM, also when the source is in a different partition than the sink? </w:t>
+      </w:r>
+      <w:r>
+        <w:rPr>
+          <w:lang w:val="en-GB"/>
+        </w:rPr>
+        <w:br/>
         <w:t xml:space="preserve">A: </w:t>
       </w:r>
-    </w:p>
-    <w:p>
-      <w:pPr>
-        <w:rPr>
-          <w:lang w:val="en-GB"/>
-        </w:rPr>
-      </w:pPr>
+      <w:r>
+        <w:rPr>
+          <w:lang w:val="en-GB"/>
+        </w:rPr>
+        <w:t>Yes</w:t>
+      </w:r>
+    </w:p>
+    <w:p>
+      <w:pPr>
+        <w:numPr>
+          <w:ilvl w:val="0"/>
+          <w:numId w:val="5"/>
+        </w:numPr>
+        <w:rPr>
+          <w:lang w:val="en-GB"/>
+        </w:rPr>
+      </w:pPr>
+      <w:r>
+        <w:rPr>
+          <w:lang w:val="en-GB"/>
+        </w:rPr>
+        <w:t xml:space="preserve">Q: </w:t>
+      </w:r>
+      <w:r>
+        <w:rPr>
+          <w:lang w:val="en-GB"/>
+        </w:rPr>
+        <w:t xml:space="preserve">Are multiple sources/sinks in one D-Flow FM-3D-cell allowed? </w:t>
+      </w:r>
+      <w:r>
+        <w:rPr>
+          <w:lang w:val="en-GB"/>
+        </w:rPr>
+        <w:br/>
+        <w:t xml:space="preserve">A: </w:t>
+      </w:r>
+      <w:r>
+        <w:rPr>
+          <w:lang w:val="en-GB"/>
+        </w:rPr>
+        <w:t>Technically: allowed, sinks: not safe-guarded</w:t>
+      </w:r>
+    </w:p>
+    <w:p>
+      <w:pPr>
+        <w:numPr>
+          <w:ilvl w:val="0"/>
+          <w:numId w:val="5"/>
+        </w:numPr>
+        <w:rPr>
+          <w:lang w:val="en-GB"/>
+        </w:rPr>
+      </w:pPr>
+      <w:r>
+        <w:rPr>
+          <w:lang w:val="en-GB"/>
+        </w:rPr>
+        <w:t xml:space="preserve">Q: </w:t>
+      </w:r>
+      <w:r>
+        <w:rPr>
+          <w:lang w:val="en-GB"/>
+        </w:rPr>
+        <w:t xml:space="preserve">3000+ sources/sinks, multiple per 3Dcell: lumping advised/necessary? </w:t>
+      </w:r>
+      <w:r>
+        <w:rPr>
+          <w:lang w:val="en-GB"/>
+        </w:rPr>
+        <w:br/>
+        <w:t xml:space="preserve">A: </w:t>
+      </w:r>
+      <w:r>
+        <w:rPr>
+          <w:lang w:val="en-GB"/>
+        </w:rPr>
+        <w:t>It should not be a problem, can be done later if needed</w:t>
+      </w:r>
+    </w:p>
+    <w:p>
+      <w:pPr>
+        <w:numPr>
+          <w:ilvl w:val="0"/>
+          <w:numId w:val="5"/>
+        </w:numPr>
+        <w:rPr>
+          <w:lang w:val="en-GB"/>
+        </w:rPr>
+      </w:pPr>
+      <w:r>
+        <w:rPr>
+          <w:lang w:val="en-GB"/>
+        </w:rPr>
+        <w:t xml:space="preserve">Q: </w:t>
+      </w:r>
+      <w:r>
+        <w:rPr>
+          <w:lang w:val="en-GB"/>
+        </w:rPr>
+        <w:t xml:space="preserve">Might conflicts pop up related to bubble screen implementation? </w:t>
+      </w:r>
+      <w:r>
+        <w:rPr>
+          <w:lang w:val="en-GB"/>
+        </w:rPr>
+        <w:br/>
+        <w:t xml:space="preserve">A: </w:t>
+      </w:r>
+      <w:r>
+        <w:rPr>
+          <w:lang w:val="en-GB"/>
+        </w:rPr>
+        <w:t>No</w:t>
+      </w:r>
+      <w:r>
+        <w:rPr>
+          <w:lang w:val="en-GB"/>
+        </w:rPr>
+        <w:t xml:space="preserve"> conflicts</w:t>
+      </w:r>
+      <w:r>
+        <w:rPr>
+          <w:lang w:val="en-GB"/>
+        </w:rPr>
+        <w:t xml:space="preserve"> expected; </w:t>
+      </w:r>
+      <w:r>
+        <w:rPr>
+          <w:lang w:val="en-GB"/>
+        </w:rPr>
+        <w:t>bubble screens are added as “normal”, “static” source/sinks and will not affect the nearfield implementation in D-Flow FM</w:t>
+      </w:r>
+    </w:p>
+    <w:p>
+      <w:pPr>
+        <w:numPr>
+          <w:ilvl w:val="0"/>
+          <w:numId w:val="5"/>
+        </w:numPr>
+        <w:rPr>
+          <w:lang w:val="en-GB"/>
+        </w:rPr>
+      </w:pPr>
+      <w:r>
+        <w:rPr>
+          <w:lang w:val="en-GB"/>
+        </w:rPr>
+        <w:t xml:space="preserve">Q: </w:t>
+      </w:r>
+      <w:r>
+        <w:rPr>
+          <w:lang w:val="en-GB"/>
+        </w:rPr>
+        <w:t xml:space="preserve">Avoid multiple re-allocating of source arrays. </w:t>
+      </w:r>
+      <w:r>
+        <w:rPr>
+          <w:lang w:val="en-GB"/>
+        </w:rPr>
+        <w:br/>
+        <w:t xml:space="preserve">A: </w:t>
+      </w:r>
+      <w:r>
+        <w:rPr>
+          <w:lang w:val="en-GB"/>
+        </w:rPr>
+        <w:t>Possible to use some maximum dimension and keep everything allocated?</w:t>
+      </w:r>
+    </w:p>
+    <w:p>
+      <w:pPr>
+        <w:rPr>
+          <w:lang w:val="en-GB"/>
+        </w:rPr>
+      </w:pPr>
+    </w:p>
+    <w:p>
+      <w:pPr>
+        <w:pStyle w:val="Heading1"/>
+        <w:rPr>
+          <w:lang w:val="en-GB"/>
+        </w:rPr>
+      </w:pPr>
+      <w:r>
+        <w:rPr>
+          <w:lang w:val="en-GB"/>
+        </w:rPr>
+        <w:t>QandA SEA-team</w:t>
+      </w:r>
+    </w:p>
+    <w:p>
+      <w:pPr>
+        <w:pStyle w:val="ListParagraph"/>
+        <w:numPr>
+          <w:ilvl w:val="0"/>
+          <w:numId w:val="6"/>
+        </w:numPr>
+        <w:rPr>
+          <w:lang w:val="en-GB"/>
+        </w:rPr>
+      </w:pPr>
+      <w:r>
+        <w:rPr>
+          <w:lang w:val="en-GB"/>
+        </w:rPr>
+        <w:t>Q: How to limit the constituent quantities</w:t>
+      </w:r>
+      <w:r>
+        <w:rPr>
+          <w:lang w:val="en-GB"/>
+        </w:rPr>
+        <w:br/>
+        <w:t>A: The number of quantities must be specified in the C-SUMO config file</w:t>
+      </w:r>
+    </w:p>
+    <w:p>
+      <w:pPr>
+        <w:pStyle w:val="ListParagraph"/>
+        <w:numPr>
+          <w:ilvl w:val="0"/>
+          <w:numId w:val="6"/>
+        </w:numPr>
+        <w:rPr>
+          <w:lang w:val="en-GB"/>
+        </w:rPr>
+      </w:pPr>
+      <w:r>
+        <w:rPr>
+          <w:lang w:val="en-GB"/>
+        </w:rPr>
+        <w:t>Q: How to define/exchange constituent names</w:t>
+      </w:r>
+      <w:r>
+        <w:rPr>
+          <w:lang w:val="en-GB"/>
+        </w:rPr>
+        <w:br/>
+        <w:t>A: In C-SUMO_preCICE, use the following standard names for the constituents:</w:t>
+      </w:r>
+      <w:r>
+        <w:rPr>
+          <w:lang w:val="en-GB"/>
+        </w:rPr>
+        <w:br/>
+      </w:r>
+    </w:p>
+    <w:p>
+      <w:pPr>
+        <w:pStyle w:val="ListParagraph"/>
+        <w:numPr>
+          <w:ilvl w:val="0"/>
+          <w:numId w:val="6"/>
+        </w:numPr>
+        <w:rPr>
+          <w:lang w:val="en-GB"/>
+        </w:rPr>
+      </w:pPr>
+      <w:r>
+        <w:rPr>
+          <w:lang w:val="en-GB"/>
+        </w:rPr>
+        <w:t>Q: Handle below bedlevel, above waterlevel correctly</w:t>
+      </w:r>
+    </w:p>
+    <w:p>
+      <w:pPr>
+        <w:pStyle w:val="Heading1"/>
+        <w:rPr>
+          <w:lang w:val="en-GB"/>
+        </w:rPr>
+      </w:pPr>
+      <w:r>
+        <w:rPr>
+          <w:lang w:val="en-GB"/>
+        </w:rPr>
+        <w:t>Remarks</w:t>
+      </w:r>
+    </w:p>
+    <w:p>
+      <w:pPr>
+        <w:pStyle w:val="ListParagraph"/>
+        <w:numPr>
+          <w:ilvl w:val="0"/>
+          <w:numId w:val="4"/>
+        </w:numPr>
+        <w:rPr>
+          <w:lang w:val="en-GB"/>
+        </w:rPr>
+      </w:pPr>
+      <w:r>
+        <w:rPr>
+          <w:lang w:val="en-GB"/>
+        </w:rPr>
+        <w:t>Key point is that we aim on refactoring the communication from C-SUMO_precice to D-Flow FM. The goal is to make the data being transferred independent of the D-Flow FM grid (mapping to the grid should happen inside D-Flow FM) and independent of the diffusor geometry (data entering D-Flow FM should just be a cloud of source/sink points). As a result, the routines related to DESA should be moved from D-Flow FM to C-SUMO_precice.</w:t>
+      </w:r>
+    </w:p>
+    <w:p>
+      <w:pPr>
+        <w:pStyle w:val="ListParagraph"/>
+        <w:numPr>
+          <w:ilvl w:val="0"/>
+          <w:numId w:val="4"/>
+        </w:numPr>
+        <w:rPr>
+          <w:lang w:val="en-GB"/>
+        </w:rPr>
+      </w:pPr>
+      <w:r>
+        <w:rPr>
+          <w:lang w:val="en-GB"/>
+        </w:rPr>
+        <w:t>PreCICE can only transfer real-type data on “a” grid</w:t>
+      </w:r>
+    </w:p>
+    <w:p>
+      <w:pPr>
+        <w:pStyle w:val="ListParagraph"/>
+        <w:numPr>
+          <w:ilvl w:val="0"/>
+          <w:numId w:val="4"/>
+        </w:numPr>
+        <w:rPr>
+          <w:lang w:val="en-GB"/>
+        </w:rPr>
+      </w:pPr>
+      <w:r>
+        <w:rPr>
+          <w:lang w:val="en-GB"/>
+        </w:rPr>
+        <w:t xml:space="preserve">Handle below bedlevel, above waterlevel correctly: handle on </w:t>
+      </w:r>
+      <w:r>
+        <w:rPr>
+          <w:lang w:val="en-GB"/>
+        </w:rPr>
+        <w:t xml:space="preserve">D-Flow </w:t>
+      </w:r>
+      <w:r>
+        <w:rPr>
+          <w:lang w:val="en-GB"/>
+        </w:rPr>
+        <w:t>FM side, for now</w:t>
+      </w:r>
+      <w:r>
+        <w:rPr>
+          <w:lang w:val="en-GB"/>
+        </w:rPr>
+        <w:t>: stop with an</w:t>
+      </w:r>
+      <w:r>
+        <w:rPr>
+          <w:lang w:val="en-GB"/>
+        </w:rPr>
+        <w:t xml:space="preserve"> error</w:t>
+      </w:r>
+      <w:r>
+        <w:rPr>
+          <w:lang w:val="en-GB"/>
+        </w:rPr>
+        <w:t xml:space="preserve"> </w:t>
+      </w:r>
+      <w:r>
+        <w:rPr>
+          <w:lang w:val="en-GB"/>
+        </w:rPr>
+        <w:t>message</w:t>
+      </w:r>
+      <w:r>
+        <w:rPr>
+          <w:lang w:val="en-GB"/>
+        </w:rPr>
+        <w:t xml:space="preserve"> when a source/sink is:</w:t>
+      </w:r>
+    </w:p>
+    <w:p>
+      <w:pPr>
+        <w:pStyle w:val="ListParagraph"/>
+        <w:numPr>
+          <w:ilvl w:val="1"/>
+          <w:numId w:val="4"/>
+        </w:numPr>
+        <w:rPr>
+          <w:lang w:val="en-GB"/>
+        </w:rPr>
+      </w:pPr>
+      <w:r>
+        <w:rPr>
+          <w:lang w:val="en-GB"/>
+        </w:rPr>
+        <w:t xml:space="preserve"> </w:t>
+      </w:r>
+      <w:r>
+        <w:rPr>
+          <w:lang w:val="en-GB"/>
+        </w:rPr>
+        <w:t>Vertically outside the domain (above waterlevel or below bedlevel)</w:t>
+      </w:r>
+    </w:p>
+    <w:p>
+      <w:pPr>
+        <w:pStyle w:val="ListParagraph"/>
+        <w:numPr>
+          <w:ilvl w:val="1"/>
+          <w:numId w:val="4"/>
+        </w:numPr>
+        <w:rPr>
+          <w:lang w:val="en-GB"/>
+        </w:rPr>
+      </w:pPr>
+      <w:r>
+        <w:rPr>
+          <w:lang w:val="en-GB"/>
+        </w:rPr>
+        <w:t>H</w:t>
+      </w:r>
+      <w:r>
+        <w:rPr>
+          <w:lang w:val="en-GB"/>
+        </w:rPr>
+        <w:t xml:space="preserve">orizontally </w:t>
+      </w:r>
+      <w:r>
+        <w:rPr>
+          <w:lang w:val="en-GB"/>
+        </w:rPr>
+        <w:t xml:space="preserve">outside all partitioned domains </w:t>
+      </w:r>
+      <w:r>
+        <w:rPr>
+          <w:lang w:val="en-GB"/>
+        </w:rPr>
+        <w:t>(</w:t>
+      </w:r>
+      <w:r>
+        <w:rPr>
+          <w:lang w:val="en-GB"/>
+        </w:rPr>
+        <w:t xml:space="preserve">use </w:t>
+      </w:r>
+      <w:r>
+        <w:rPr>
+          <w:lang w:val="en-GB"/>
+        </w:rPr>
+        <w:t>mpi reduce</w:t>
+      </w:r>
+      <w:r>
+        <w:rPr>
+          <w:lang w:val="en-GB"/>
+        </w:rPr>
+        <w:t xml:space="preserve"> to detect</w:t>
+      </w:r>
+      <w:r>
+        <w:rPr>
+          <w:lang w:val="en-GB"/>
+        </w:rPr>
+        <w:t>)</w:t>
+      </w:r>
+    </w:p>
+    <w:p>
+      <w:pPr>
+        <w:pStyle w:val="ListParagraph"/>
+        <w:numPr>
+          <w:ilvl w:val="0"/>
+          <w:numId w:val="4"/>
+        </w:numPr>
+        <w:rPr>
+          <w:lang w:val="en-GB"/>
+        </w:rPr>
+      </w:pPr>
+      <w:r>
+        <w:rPr>
+          <w:lang w:val="en-GB"/>
+        </w:rPr>
+        <w:t xml:space="preserve">How to interpolate FM data to the C-SUMO “grid”: preCICE interpolation 3D </w:t>
+      </w:r>
     </w:p>
     <w:sectPr>
       <w:pgSz w:w="11906" w:h="16838"/>
@@ -1052,6 +1400,205 @@
     </w:lvl>
   </w:abstractNum>
   <w:abstractNum w:abstractNumId="1" w15:restartNumberingAfterBreak="0">
+    <w:nsid w:val="284F25ED"/>
+    <w:multiLevelType w:val="hybridMultilevel"/>
+    <w:tmpl w:val="48C4FA66"/>
+    <w:lvl w:ilvl="0" w:tplc="0413000F">
+      <w:start w:val="1"/>
+      <w:numFmt w:val="decimal"/>
+      <w:lvlText w:val="%1."/>
+      <w:lvlJc w:val="left"/>
+      <w:pPr>
+        <w:ind w:left="720" w:hanging="360"/>
+      </w:pPr>
+    </w:lvl>
+    <w:lvl w:ilvl="1" w:tplc="04130019" w:tentative="1">
+      <w:start w:val="1"/>
+      <w:numFmt w:val="lowerLetter"/>
+      <w:lvlText w:val="%2."/>
+      <w:lvlJc w:val="left"/>
+      <w:pPr>
+        <w:ind w:left="1440" w:hanging="360"/>
+      </w:pPr>
+    </w:lvl>
+    <w:lvl w:ilvl="2" w:tplc="0413001B" w:tentative="1">
+      <w:start w:val="1"/>
+      <w:numFmt w:val="lowerRoman"/>
+      <w:lvlText w:val="%3."/>
+      <w:lvlJc w:val="right"/>
+      <w:pPr>
+        <w:ind w:left="2160" w:hanging="180"/>
+      </w:pPr>
+    </w:lvl>
+    <w:lvl w:ilvl="3" w:tplc="0413000F" w:tentative="1">
+      <w:start w:val="1"/>
+      <w:numFmt w:val="decimal"/>
+      <w:lvlText w:val="%4."/>
+      <w:lvlJc w:val="left"/>
+      <w:pPr>
+        <w:ind w:left="2880" w:hanging="360"/>
+      </w:pPr>
+    </w:lvl>
+    <w:lvl w:ilvl="4" w:tplc="04130019" w:tentative="1">
+      <w:start w:val="1"/>
+      <w:numFmt w:val="lowerLetter"/>
+      <w:lvlText w:val="%5."/>
+      <w:lvlJc w:val="left"/>
+      <w:pPr>
+        <w:ind w:left="3600" w:hanging="360"/>
+      </w:pPr>
+    </w:lvl>
+    <w:lvl w:ilvl="5" w:tplc="0413001B" w:tentative="1">
+      <w:start w:val="1"/>
+      <w:numFmt w:val="lowerRoman"/>
+      <w:lvlText w:val="%6."/>
+      <w:lvlJc w:val="right"/>
+      <w:pPr>
+        <w:ind w:left="4320" w:hanging="180"/>
+      </w:pPr>
+    </w:lvl>
+    <w:lvl w:ilvl="6" w:tplc="0413000F" w:tentative="1">
+      <w:start w:val="1"/>
+      <w:numFmt w:val="decimal"/>
+      <w:lvlText w:val="%7."/>
+      <w:lvlJc w:val="left"/>
+      <w:pPr>
+        <w:ind w:left="5040" w:hanging="360"/>
+      </w:pPr>
+    </w:lvl>
+    <w:lvl w:ilvl="7" w:tplc="04130019" w:tentative="1">
+      <w:start w:val="1"/>
+      <w:numFmt w:val="lowerLetter"/>
+      <w:lvlText w:val="%8."/>
+      <w:lvlJc w:val="left"/>
+      <w:pPr>
+        <w:ind w:left="5760" w:hanging="360"/>
+      </w:pPr>
+    </w:lvl>
+    <w:lvl w:ilvl="8" w:tplc="0413001B" w:tentative="1">
+      <w:start w:val="1"/>
+      <w:numFmt w:val="lowerRoman"/>
+      <w:lvlText w:val="%9."/>
+      <w:lvlJc w:val="right"/>
+      <w:pPr>
+        <w:ind w:left="6480" w:hanging="180"/>
+      </w:pPr>
+    </w:lvl>
+  </w:abstractNum>
+  <w:abstractNum w:abstractNumId="2" w15:restartNumberingAfterBreak="0">
+    <w:nsid w:val="290D0105"/>
+    <w:multiLevelType w:val="multilevel"/>
+    <w:tmpl w:val="91143B30"/>
+    <w:lvl w:ilvl="0">
+      <w:start w:val="1"/>
+      <w:numFmt w:val="decimal"/>
+      <w:lvlText w:val="%1."/>
+      <w:lvlJc w:val="left"/>
+      <w:pPr>
+        <w:tabs>
+          <w:tab w:val="num" w:pos="720"/>
+        </w:tabs>
+        <w:ind w:left="720" w:hanging="360"/>
+      </w:pPr>
+    </w:lvl>
+    <w:lvl w:ilvl="1">
+      <w:start w:val="1"/>
+      <w:numFmt w:val="decimal"/>
+      <w:lvlText w:val="%2."/>
+      <w:lvlJc w:val="left"/>
+      <w:pPr>
+        <w:tabs>
+          <w:tab w:val="num" w:pos="1440"/>
+        </w:tabs>
+        <w:ind w:left="1440" w:hanging="360"/>
+      </w:pPr>
+    </w:lvl>
+    <w:lvl w:ilvl="2">
+      <w:start w:val="1"/>
+      <w:numFmt w:val="decimal"/>
+      <w:lvlText w:val="%3."/>
+      <w:lvlJc w:val="left"/>
+      <w:pPr>
+        <w:tabs>
+          <w:tab w:val="num" w:pos="2160"/>
+        </w:tabs>
+        <w:ind w:left="2160" w:hanging="360"/>
+      </w:pPr>
+    </w:lvl>
+    <w:lvl w:ilvl="3">
+      <w:start w:val="1"/>
+      <w:numFmt w:val="decimal"/>
+      <w:lvlText w:val="%4."/>
+      <w:lvlJc w:val="left"/>
+      <w:pPr>
+        <w:tabs>
+          <w:tab w:val="num" w:pos="2880"/>
+        </w:tabs>
+        <w:ind w:left="2880" w:hanging="360"/>
+      </w:pPr>
+    </w:lvl>
+    <w:lvl w:ilvl="4">
+      <w:start w:val="1"/>
+      <w:numFmt w:val="decimal"/>
+      <w:lvlText w:val="%5."/>
+      <w:lvlJc w:val="left"/>
+      <w:pPr>
+        <w:tabs>
+          <w:tab w:val="num" w:pos="3600"/>
+        </w:tabs>
+        <w:ind w:left="3600" w:hanging="360"/>
+      </w:pPr>
+    </w:lvl>
+    <w:lvl w:ilvl="5">
+      <w:start w:val="1"/>
+      <w:numFmt w:val="decimal"/>
+      <w:lvlText w:val="%6."/>
+      <w:lvlJc w:val="left"/>
+      <w:pPr>
+        <w:tabs>
+          <w:tab w:val="num" w:pos="4320"/>
+        </w:tabs>
+        <w:ind w:left="4320" w:hanging="360"/>
+      </w:pPr>
+    </w:lvl>
+    <w:lvl w:ilvl="6">
+      <w:start w:val="1"/>
+      <w:numFmt w:val="decimal"/>
+      <w:lvlText w:val="%7."/>
+      <w:lvlJc w:val="left"/>
+      <w:pPr>
+        <w:tabs>
+          <w:tab w:val="num" w:pos="5040"/>
+        </w:tabs>
+        <w:ind w:left="5040" w:hanging="360"/>
+      </w:pPr>
+    </w:lvl>
+    <w:lvl w:ilvl="7">
+      <w:start w:val="1"/>
+      <w:numFmt w:val="decimal"/>
+      <w:lvlText w:val="%8."/>
+      <w:lvlJc w:val="left"/>
+      <w:pPr>
+        <w:tabs>
+          <w:tab w:val="num" w:pos="5760"/>
+        </w:tabs>
+        <w:ind w:left="5760" w:hanging="360"/>
+      </w:pPr>
+    </w:lvl>
+    <w:lvl w:ilvl="8">
+      <w:start w:val="1"/>
+      <w:numFmt w:val="decimal"/>
+      <w:lvlText w:val="%9."/>
+      <w:lvlJc w:val="left"/>
+      <w:pPr>
+        <w:tabs>
+          <w:tab w:val="num" w:pos="6480"/>
+        </w:tabs>
+        <w:ind w:left="6480" w:hanging="360"/>
+      </w:pPr>
+    </w:lvl>
+  </w:abstractNum>
+  <w:abstractNum w:abstractNumId="3" w15:restartNumberingAfterBreak="0">
     <w:nsid w:val="31F52E15"/>
     <w:multiLevelType w:val="multilevel"/>
     <w:tmpl w:val="1CFE7CE8"/>
@@ -1164,8 +1711,207 @@
       </w:pPr>
     </w:lvl>
   </w:abstractNum>
+  <w:abstractNum w:abstractNumId="4" w15:restartNumberingAfterBreak="0">
+    <w:nsid w:val="39327D93"/>
+    <w:multiLevelType w:val="hybridMultilevel"/>
+    <w:tmpl w:val="9E221C4C"/>
+    <w:lvl w:ilvl="0" w:tplc="0413000F">
+      <w:start w:val="1"/>
+      <w:numFmt w:val="decimal"/>
+      <w:lvlText w:val="%1."/>
+      <w:lvlJc w:val="left"/>
+      <w:pPr>
+        <w:ind w:left="720" w:hanging="360"/>
+      </w:pPr>
+    </w:lvl>
+    <w:lvl w:ilvl="1" w:tplc="04130019">
+      <w:start w:val="1"/>
+      <w:numFmt w:val="lowerLetter"/>
+      <w:lvlText w:val="%2."/>
+      <w:lvlJc w:val="left"/>
+      <w:pPr>
+        <w:ind w:left="1440" w:hanging="360"/>
+      </w:pPr>
+    </w:lvl>
+    <w:lvl w:ilvl="2" w:tplc="0413001B" w:tentative="1">
+      <w:start w:val="1"/>
+      <w:numFmt w:val="lowerRoman"/>
+      <w:lvlText w:val="%3."/>
+      <w:lvlJc w:val="right"/>
+      <w:pPr>
+        <w:ind w:left="2160" w:hanging="180"/>
+      </w:pPr>
+    </w:lvl>
+    <w:lvl w:ilvl="3" w:tplc="0413000F" w:tentative="1">
+      <w:start w:val="1"/>
+      <w:numFmt w:val="decimal"/>
+      <w:lvlText w:val="%4."/>
+      <w:lvlJc w:val="left"/>
+      <w:pPr>
+        <w:ind w:left="2880" w:hanging="360"/>
+      </w:pPr>
+    </w:lvl>
+    <w:lvl w:ilvl="4" w:tplc="04130019" w:tentative="1">
+      <w:start w:val="1"/>
+      <w:numFmt w:val="lowerLetter"/>
+      <w:lvlText w:val="%5."/>
+      <w:lvlJc w:val="left"/>
+      <w:pPr>
+        <w:ind w:left="3600" w:hanging="360"/>
+      </w:pPr>
+    </w:lvl>
+    <w:lvl w:ilvl="5" w:tplc="0413001B" w:tentative="1">
+      <w:start w:val="1"/>
+      <w:numFmt w:val="lowerRoman"/>
+      <w:lvlText w:val="%6."/>
+      <w:lvlJc w:val="right"/>
+      <w:pPr>
+        <w:ind w:left="4320" w:hanging="180"/>
+      </w:pPr>
+    </w:lvl>
+    <w:lvl w:ilvl="6" w:tplc="0413000F" w:tentative="1">
+      <w:start w:val="1"/>
+      <w:numFmt w:val="decimal"/>
+      <w:lvlText w:val="%7."/>
+      <w:lvlJc w:val="left"/>
+      <w:pPr>
+        <w:ind w:left="5040" w:hanging="360"/>
+      </w:pPr>
+    </w:lvl>
+    <w:lvl w:ilvl="7" w:tplc="04130019" w:tentative="1">
+      <w:start w:val="1"/>
+      <w:numFmt w:val="lowerLetter"/>
+      <w:lvlText w:val="%8."/>
+      <w:lvlJc w:val="left"/>
+      <w:pPr>
+        <w:ind w:left="5760" w:hanging="360"/>
+      </w:pPr>
+    </w:lvl>
+    <w:lvl w:ilvl="8" w:tplc="0413001B" w:tentative="1">
+      <w:start w:val="1"/>
+      <w:numFmt w:val="lowerRoman"/>
+      <w:lvlText w:val="%9."/>
+      <w:lvlJc w:val="right"/>
+      <w:pPr>
+        <w:ind w:left="6480" w:hanging="180"/>
+      </w:pPr>
+    </w:lvl>
+  </w:abstractNum>
+  <w:abstractNum w:abstractNumId="5" w15:restartNumberingAfterBreak="0">
+    <w:nsid w:val="660C3624"/>
+    <w:multiLevelType w:val="multilevel"/>
+    <w:tmpl w:val="8A00C328"/>
+    <w:lvl w:ilvl="0">
+      <w:start w:val="1"/>
+      <w:numFmt w:val="decimal"/>
+      <w:lvlText w:val="%1."/>
+      <w:lvlJc w:val="left"/>
+      <w:pPr>
+        <w:tabs>
+          <w:tab w:val="num" w:pos="720"/>
+        </w:tabs>
+        <w:ind w:left="720" w:hanging="360"/>
+      </w:pPr>
+    </w:lvl>
+    <w:lvl w:ilvl="1">
+      <w:start w:val="1"/>
+      <w:numFmt w:val="decimal"/>
+      <w:lvlText w:val="%2."/>
+      <w:lvlJc w:val="left"/>
+      <w:pPr>
+        <w:tabs>
+          <w:tab w:val="num" w:pos="1440"/>
+        </w:tabs>
+        <w:ind w:left="1440" w:hanging="360"/>
+      </w:pPr>
+    </w:lvl>
+    <w:lvl w:ilvl="2">
+      <w:start w:val="1"/>
+      <w:numFmt w:val="decimal"/>
+      <w:lvlText w:val="%3."/>
+      <w:lvlJc w:val="left"/>
+      <w:pPr>
+        <w:tabs>
+          <w:tab w:val="num" w:pos="2160"/>
+        </w:tabs>
+        <w:ind w:left="2160" w:hanging="360"/>
+      </w:pPr>
+    </w:lvl>
+    <w:lvl w:ilvl="3">
+      <w:start w:val="1"/>
+      <w:numFmt w:val="decimal"/>
+      <w:lvlText w:val="%4."/>
+      <w:lvlJc w:val="left"/>
+      <w:pPr>
+        <w:tabs>
+          <w:tab w:val="num" w:pos="2880"/>
+        </w:tabs>
+        <w:ind w:left="2880" w:hanging="360"/>
+      </w:pPr>
+    </w:lvl>
+    <w:lvl w:ilvl="4">
+      <w:start w:val="1"/>
+      <w:numFmt w:val="decimal"/>
+      <w:lvlText w:val="%5."/>
+      <w:lvlJc w:val="left"/>
+      <w:pPr>
+        <w:tabs>
+          <w:tab w:val="num" w:pos="3600"/>
+        </w:tabs>
+        <w:ind w:left="3600" w:hanging="360"/>
+      </w:pPr>
+    </w:lvl>
+    <w:lvl w:ilvl="5">
+      <w:start w:val="1"/>
+      <w:numFmt w:val="decimal"/>
+      <w:lvlText w:val="%6."/>
+      <w:lvlJc w:val="left"/>
+      <w:pPr>
+        <w:tabs>
+          <w:tab w:val="num" w:pos="4320"/>
+        </w:tabs>
+        <w:ind w:left="4320" w:hanging="360"/>
+      </w:pPr>
+    </w:lvl>
+    <w:lvl w:ilvl="6">
+      <w:start w:val="1"/>
+      <w:numFmt w:val="decimal"/>
+      <w:lvlText w:val="%7."/>
+      <w:lvlJc w:val="left"/>
+      <w:pPr>
+        <w:tabs>
+          <w:tab w:val="num" w:pos="5040"/>
+        </w:tabs>
+        <w:ind w:left="5040" w:hanging="360"/>
+      </w:pPr>
+    </w:lvl>
+    <w:lvl w:ilvl="7">
+      <w:start w:val="1"/>
+      <w:numFmt w:val="decimal"/>
+      <w:lvlText w:val="%8."/>
+      <w:lvlJc w:val="left"/>
+      <w:pPr>
+        <w:tabs>
+          <w:tab w:val="num" w:pos="5760"/>
+        </w:tabs>
+        <w:ind w:left="5760" w:hanging="360"/>
+      </w:pPr>
+    </w:lvl>
+    <w:lvl w:ilvl="8">
+      <w:start w:val="1"/>
+      <w:numFmt w:val="decimal"/>
+      <w:lvlText w:val="%9."/>
+      <w:lvlJc w:val="left"/>
+      <w:pPr>
+        <w:tabs>
+          <w:tab w:val="num" w:pos="6480"/>
+        </w:tabs>
+        <w:ind w:left="6480" w:hanging="360"/>
+      </w:pPr>
+    </w:lvl>
+  </w:abstractNum>
   <w:num w:numId="1" w16cid:durableId="1418556239">
-    <w:abstractNumId w:val="1"/>
+    <w:abstractNumId w:val="3"/>
     <w:lvlOverride w:ilvl="0">
       <w:startOverride w:val="1"/>
     </w:lvlOverride>
@@ -1196,6 +1942,75 @@
   </w:num>
   <w:num w:numId="2" w16cid:durableId="1090388201">
     <w:abstractNumId w:val="0"/>
+    <w:lvlOverride w:ilvl="0">
+      <w:startOverride w:val="1"/>
+    </w:lvlOverride>
+    <w:lvlOverride w:ilvl="1">
+      <w:startOverride w:val="1"/>
+    </w:lvlOverride>
+    <w:lvlOverride w:ilvl="2">
+      <w:startOverride w:val="1"/>
+    </w:lvlOverride>
+    <w:lvlOverride w:ilvl="3">
+      <w:startOverride w:val="1"/>
+    </w:lvlOverride>
+    <w:lvlOverride w:ilvl="4">
+      <w:startOverride w:val="1"/>
+    </w:lvlOverride>
+    <w:lvlOverride w:ilvl="5">
+      <w:startOverride w:val="1"/>
+    </w:lvlOverride>
+    <w:lvlOverride w:ilvl="6">
+      <w:startOverride w:val="1"/>
+    </w:lvlOverride>
+    <w:lvlOverride w:ilvl="7">
+      <w:startOverride w:val="1"/>
+    </w:lvlOverride>
+    <w:lvlOverride w:ilvl="8">
+      <w:startOverride w:val="1"/>
+    </w:lvlOverride>
+  </w:num>
+  <w:num w:numId="3" w16cid:durableId="1408385672">
+    <w:abstractNumId w:val="0"/>
+  </w:num>
+  <w:num w:numId="4" w16cid:durableId="153570527">
+    <w:abstractNumId w:val="4"/>
+  </w:num>
+  <w:num w:numId="5" w16cid:durableId="20327157">
+    <w:abstractNumId w:val="5"/>
+    <w:lvlOverride w:ilvl="0">
+      <w:startOverride w:val="1"/>
+    </w:lvlOverride>
+    <w:lvlOverride w:ilvl="1">
+      <w:startOverride w:val="1"/>
+    </w:lvlOverride>
+    <w:lvlOverride w:ilvl="2">
+      <w:startOverride w:val="1"/>
+    </w:lvlOverride>
+    <w:lvlOverride w:ilvl="3">
+      <w:startOverride w:val="1"/>
+    </w:lvlOverride>
+    <w:lvlOverride w:ilvl="4">
+      <w:startOverride w:val="1"/>
+    </w:lvlOverride>
+    <w:lvlOverride w:ilvl="5">
+      <w:startOverride w:val="1"/>
+    </w:lvlOverride>
+    <w:lvlOverride w:ilvl="6">
+      <w:startOverride w:val="1"/>
+    </w:lvlOverride>
+    <w:lvlOverride w:ilvl="7">
+      <w:startOverride w:val="1"/>
+    </w:lvlOverride>
+    <w:lvlOverride w:ilvl="8">
+      <w:startOverride w:val="1"/>
+    </w:lvlOverride>
+  </w:num>
+  <w:num w:numId="6" w16cid:durableId="1354116509">
+    <w:abstractNumId w:val="1"/>
+  </w:num>
+  <w:num w:numId="7" w16cid:durableId="1500269734">
+    <w:abstractNumId w:val="2"/>
     <w:lvlOverride w:ilvl="0">
       <w:startOverride w:val="1"/>
     </w:lvlOverride>

</xml_diff>

<commit_message>
UNST-9576: doc updated (#641)
Based on Mail from Wilbert Verbruggen, ma 16-2-2-2026 16:08
</commit_message>
<xml_diff>
--- a/src/tools_gpl/csumo_precice/docs/design_questions.docx
+++ b/src/tools_gpl/csumo_precice/docs/design_questions.docx
@@ -13,13 +13,27 @@
         <w:rPr>
           <w:lang w:val="en-GB"/>
         </w:rPr>
-        <w:t>D-Flow FM – C-SUMO_</w:t>
-      </w:r>
-      <w:r>
-        <w:rPr>
-          <w:lang w:val="en-GB"/>
-        </w:rPr>
-        <w:t>precice – C-SUMO</w:t>
+        <w:t>D-Flow FM – C-</w:t>
+      </w:r>
+      <w:proofErr w:type="spellStart"/>
+      <w:r>
+        <w:rPr>
+          <w:lang w:val="en-GB"/>
+        </w:rPr>
+        <w:t>SUMO_</w:t>
+      </w:r>
+      <w:r>
+        <w:rPr>
+          <w:lang w:val="en-GB"/>
+        </w:rPr>
+        <w:t>precice</w:t>
+      </w:r>
+      <w:proofErr w:type="spellEnd"/>
+      <w:r>
+        <w:rPr>
+          <w:lang w:val="en-GB"/>
+        </w:rPr>
+        <w:t xml:space="preserve"> – C-SUMO</w:t>
       </w:r>
     </w:p>
     <w:p>
@@ -46,7 +60,49 @@
         <w:rPr>
           <w:lang w:val="en-GB"/>
         </w:rPr>
-        <w:t xml:space="preserve">We’re designing the communication between D-Flow FM and the C-SUMO_preCICE wrapper. We intent to keep the interface as clean/generic as possible and are thinking about moving code (desa-routine) from D-Flow FM to C-SUMO_preCICE. </w:t>
+        <w:t>We’re designing the communication between D-Flow FM and the C-</w:t>
+      </w:r>
+      <w:proofErr w:type="spellStart"/>
+      <w:r>
+        <w:rPr>
+          <w:lang w:val="en-GB"/>
+        </w:rPr>
+        <w:t>SUMO_preCICE</w:t>
+      </w:r>
+      <w:proofErr w:type="spellEnd"/>
+      <w:r>
+        <w:rPr>
+          <w:lang w:val="en-GB"/>
+        </w:rPr>
+        <w:t xml:space="preserve"> wrapper. We intent to keep the interface as clean/generic as possible and are thinking about moving code (</w:t>
+      </w:r>
+      <w:proofErr w:type="spellStart"/>
+      <w:r>
+        <w:rPr>
+          <w:lang w:val="en-GB"/>
+        </w:rPr>
+        <w:t>desa</w:t>
+      </w:r>
+      <w:proofErr w:type="spellEnd"/>
+      <w:r>
+        <w:rPr>
+          <w:lang w:val="en-GB"/>
+        </w:rPr>
+        <w:t>-routine) from D-Flow FM to C-</w:t>
+      </w:r>
+      <w:proofErr w:type="spellStart"/>
+      <w:r>
+        <w:rPr>
+          <w:lang w:val="en-GB"/>
+        </w:rPr>
+        <w:t>SUMO_preCICE</w:t>
+      </w:r>
+      <w:proofErr w:type="spellEnd"/>
+      <w:r>
+        <w:rPr>
+          <w:lang w:val="en-GB"/>
+        </w:rPr>
+        <w:t xml:space="preserve">. </w:t>
       </w:r>
     </w:p>
     <w:p>
@@ -56,11 +112,19 @@
           <w:lang w:val="en-GB"/>
         </w:rPr>
       </w:pPr>
-      <w:r>
-        <w:rPr>
-          <w:lang w:val="en-GB"/>
-        </w:rPr>
-        <w:t>QandA Wilbert</w:t>
+      <w:proofErr w:type="spellStart"/>
+      <w:r>
+        <w:rPr>
+          <w:lang w:val="en-GB"/>
+        </w:rPr>
+        <w:t>QandA</w:t>
+      </w:r>
+      <w:proofErr w:type="spellEnd"/>
+      <w:r>
+        <w:rPr>
+          <w:lang w:val="en-GB"/>
+        </w:rPr>
+        <w:t xml:space="preserve"> Wilbert</w:t>
       </w:r>
     </w:p>
     <w:p>
@@ -83,7 +147,21 @@
         <w:rPr>
           <w:lang w:val="en-GB"/>
         </w:rPr>
-        <w:t>Must the DIMR coupling still work when the preCICE coupling is added?</w:t>
+        <w:t xml:space="preserve">Must the DIMR coupling still work when the </w:t>
+      </w:r>
+      <w:proofErr w:type="spellStart"/>
+      <w:r>
+        <w:rPr>
+          <w:lang w:val="en-GB"/>
+        </w:rPr>
+        <w:t>preCICE</w:t>
+      </w:r>
+      <w:proofErr w:type="spellEnd"/>
+      <w:r>
+        <w:rPr>
+          <w:lang w:val="en-GB"/>
+        </w:rPr>
+        <w:t xml:space="preserve"> coupling is added?</w:t>
       </w:r>
       <w:r>
         <w:rPr>
@@ -103,7 +181,21 @@
         <w:rPr>
           <w:lang w:val="en-GB"/>
         </w:rPr>
-        <w:t>If the preCICE coupling can be used, then the DIMR coupling is not needed anymore.</w:t>
+        <w:t xml:space="preserve">If the </w:t>
+      </w:r>
+      <w:proofErr w:type="spellStart"/>
+      <w:r>
+        <w:rPr>
+          <w:lang w:val="en-GB"/>
+        </w:rPr>
+        <w:t>preCICE</w:t>
+      </w:r>
+      <w:proofErr w:type="spellEnd"/>
+      <w:r>
+        <w:rPr>
+          <w:lang w:val="en-GB"/>
+        </w:rPr>
+        <w:t xml:space="preserve"> coupling can be used, then the DIMR coupling is not needed anymore.</w:t>
       </w:r>
     </w:p>
     <w:p>
@@ -155,15 +247,21 @@
         <w:rPr>
           <w:lang w:val="en-GB"/>
         </w:rPr>
-        <w:t xml:space="preserve">The user is responsible for ensuring that this does not happen. It might be useful to stop with an error message if it does happen, </w:t>
-      </w:r>
-      <w:r>
-        <w:rPr>
-          <w:b/>
-          <w:bCs/>
-          <w:lang w:val="en-GB"/>
-        </w:rPr>
-        <w:t>but Wilbert will come back on this.</w:t>
+        <w:t xml:space="preserve">For our studies it is typically important that we discharge the right amount of effluent into the coastal zone. Say that 50% of the source is specified outside the network, we would still like to discharge 100% of the </w:t>
+      </w:r>
+      <w:proofErr w:type="spellStart"/>
+      <w:r>
+        <w:rPr>
+          <w:lang w:val="en-GB"/>
+        </w:rPr>
+        <w:t>Qsource</w:t>
+      </w:r>
+      <w:proofErr w:type="spellEnd"/>
+      <w:r>
+        <w:rPr>
+          <w:lang w:val="en-GB"/>
+        </w:rPr>
+        <w:t xml:space="preserve"> in the remaining active cells. The same holds for the entrainment, if part of the sinks are outside the model network, we still would like to entrain the intended amount of water to make sure we have the intended dilution of the effluent.</w:t>
       </w:r>
     </w:p>
     <w:p>
@@ -173,54 +271,42 @@
           <w:numId w:val="1"/>
         </w:numPr>
         <w:rPr>
-          <w:lang w:val="en-GB"/>
-        </w:rPr>
-      </w:pPr>
-      <w:r>
-        <w:rPr>
-          <w:lang w:val="en-GB"/>
-        </w:rPr>
-        <w:t xml:space="preserve">Q: </w:t>
-      </w:r>
-      <w:r>
-        <w:rPr>
-          <w:lang w:val="en-GB"/>
-        </w:rPr>
-        <w:t xml:space="preserve">Above waterlevel or below bedlevel: handled by FM (no changes). </w:t>
-      </w:r>
-      <w:r>
-        <w:rPr>
-          <w:lang w:val="en-GB"/>
-        </w:rPr>
-        <w:br/>
-        <w:t>Are changes needed?</w:t>
-      </w:r>
-      <w:r>
-        <w:rPr>
-          <w:lang w:val="en-GB"/>
-        </w:rPr>
-        <w:br/>
-        <w:t xml:space="preserve">A: </w:t>
-      </w:r>
-      <w:r>
-        <w:rPr>
-          <w:lang w:val="en-GB"/>
-        </w:rPr>
-        <w:t>Sources/sinks should NOT be neglected when they are completely below bedlevel or completely above waterlevel. So please add:</w:t>
-      </w:r>
-      <w:r>
-        <w:rPr>
-          <w:lang w:val="en-GB"/>
-        </w:rPr>
-        <w:br/>
-        <w:t>IF z_max &lt; bedlevel THEN errormessage_and_stop</w:t>
-      </w:r>
-      <w:r>
-        <w:rPr>
-          <w:lang w:val="en-GB"/>
-        </w:rPr>
-        <w:br/>
-        <w:t>IF z_min &gt; waterlevel THEN errormessage_and_stop</w:t>
+          <w:b/>
+          <w:bCs/>
+          <w:lang w:val="en-GB"/>
+        </w:rPr>
+      </w:pPr>
+      <w:r>
+        <w:rPr>
+          <w:lang w:val="en-GB"/>
+        </w:rPr>
+        <w:t>If that proves to be too difficult it would be best to stop the simulation with an error message. We want to prevent that the user thinks that (say) 10 m</w:t>
+      </w:r>
+      <w:r>
+        <w:rPr>
+          <w:vertAlign w:val="superscript"/>
+          <w:lang w:val="en-GB"/>
+        </w:rPr>
+        <w:t>3</w:t>
+      </w:r>
+      <w:r>
+        <w:rPr>
+          <w:lang w:val="en-GB"/>
+        </w:rPr>
+        <w:t>/s of thermal effluent is discharged, whereas in reality (due to a bad specification of the discharge location) only 5 m</w:t>
+      </w:r>
+      <w:r>
+        <w:rPr>
+          <w:vertAlign w:val="superscript"/>
+          <w:lang w:val="en-GB"/>
+        </w:rPr>
+        <w:t>3</w:t>
+      </w:r>
+      <w:r>
+        <w:rPr>
+          <w:lang w:val="en-GB"/>
+        </w:rPr>
+        <w:t>/s is actually discharged into the model.</w:t>
       </w:r>
     </w:p>
     <w:p>
@@ -230,8 +316,6 @@
           <w:numId w:val="1"/>
         </w:numPr>
         <w:rPr>
-          <w:b/>
-          <w:bCs/>
           <w:lang w:val="en-GB"/>
         </w:rPr>
       </w:pPr>
@@ -245,21 +329,42 @@
         <w:rPr>
           <w:lang w:val="en-GB"/>
         </w:rPr>
-        <w:t>How important is "check_mixed_source_sink"?</w:t>
+        <w:t xml:space="preserve">Above </w:t>
+      </w:r>
+      <w:proofErr w:type="spellStart"/>
+      <w:r>
+        <w:rPr>
+          <w:lang w:val="en-GB"/>
+        </w:rPr>
+        <w:t>waterlevel</w:t>
+      </w:r>
+      <w:proofErr w:type="spellEnd"/>
+      <w:r>
+        <w:rPr>
+          <w:lang w:val="en-GB"/>
+        </w:rPr>
+        <w:t xml:space="preserve"> or below </w:t>
+      </w:r>
+      <w:proofErr w:type="spellStart"/>
+      <w:r>
+        <w:rPr>
+          <w:lang w:val="en-GB"/>
+        </w:rPr>
+        <w:t>bedlevel</w:t>
+      </w:r>
+      <w:proofErr w:type="spellEnd"/>
+      <w:r>
+        <w:rPr>
+          <w:lang w:val="en-GB"/>
+        </w:rPr>
+        <w:t xml:space="preserve">: handled by FM (no changes). </w:t>
       </w:r>
       <w:r>
         <w:rPr>
           <w:lang w:val="en-GB"/>
         </w:rPr>
         <w:br/>
-        <w:t xml:space="preserve">The refactoring we have in mind will disconnect the generation of all sources and sinks from the FM-grid-awareness. </w:t>
-      </w:r>
-      <w:r>
-        <w:rPr>
-          <w:lang w:val="en-GB"/>
-        </w:rPr>
-        <w:br/>
-        <w:t>Is this mix check still needed?</w:t>
+        <w:t>Are changes needed?</w:t>
       </w:r>
       <w:r>
         <w:rPr>
@@ -272,16 +377,122 @@
         <w:rPr>
           <w:lang w:val="en-GB"/>
         </w:rPr>
-        <w:t xml:space="preserve">The user is responsible for ensuring that this does not happen. It might be useful to generate some message, </w:t>
-      </w:r>
-      <w:r>
-        <w:rPr>
-          <w:b/>
-          <w:bCs/>
-          <w:lang w:val="en-GB"/>
-        </w:rPr>
-        <w:t>but Wilbert will come back on this.</w:t>
-      </w:r>
+        <w:t xml:space="preserve">Sources/sinks should NOT be neglected when they are completely below </w:t>
+      </w:r>
+      <w:proofErr w:type="spellStart"/>
+      <w:r>
+        <w:rPr>
+          <w:lang w:val="en-GB"/>
+        </w:rPr>
+        <w:t>bedlevel</w:t>
+      </w:r>
+      <w:proofErr w:type="spellEnd"/>
+      <w:r>
+        <w:rPr>
+          <w:lang w:val="en-GB"/>
+        </w:rPr>
+        <w:t xml:space="preserve"> or completely above </w:t>
+      </w:r>
+      <w:proofErr w:type="spellStart"/>
+      <w:r>
+        <w:rPr>
+          <w:lang w:val="en-GB"/>
+        </w:rPr>
+        <w:t>waterlevel</w:t>
+      </w:r>
+      <w:proofErr w:type="spellEnd"/>
+      <w:r>
+        <w:rPr>
+          <w:lang w:val="en-GB"/>
+        </w:rPr>
+        <w:t>. So please add:</w:t>
+      </w:r>
+      <w:r>
+        <w:rPr>
+          <w:lang w:val="en-GB"/>
+        </w:rPr>
+        <w:br/>
+        <w:t xml:space="preserve">IF </w:t>
+      </w:r>
+      <w:proofErr w:type="spellStart"/>
+      <w:r>
+        <w:rPr>
+          <w:lang w:val="en-GB"/>
+        </w:rPr>
+        <w:t>z_max</w:t>
+      </w:r>
+      <w:proofErr w:type="spellEnd"/>
+      <w:r>
+        <w:rPr>
+          <w:lang w:val="en-GB"/>
+        </w:rPr>
+        <w:t xml:space="preserve"> &lt; </w:t>
+      </w:r>
+      <w:proofErr w:type="spellStart"/>
+      <w:r>
+        <w:rPr>
+          <w:lang w:val="en-GB"/>
+        </w:rPr>
+        <w:t>bedlevel</w:t>
+      </w:r>
+      <w:proofErr w:type="spellEnd"/>
+      <w:r>
+        <w:rPr>
+          <w:lang w:val="en-GB"/>
+        </w:rPr>
+        <w:t xml:space="preserve"> THEN </w:t>
+      </w:r>
+      <w:proofErr w:type="spellStart"/>
+      <w:r>
+        <w:rPr>
+          <w:lang w:val="en-GB"/>
+        </w:rPr>
+        <w:t>errormessage_and_stop</w:t>
+      </w:r>
+      <w:proofErr w:type="spellEnd"/>
+      <w:r>
+        <w:rPr>
+          <w:lang w:val="en-GB"/>
+        </w:rPr>
+        <w:br/>
+        <w:t xml:space="preserve">IF </w:t>
+      </w:r>
+      <w:proofErr w:type="spellStart"/>
+      <w:r>
+        <w:rPr>
+          <w:lang w:val="en-GB"/>
+        </w:rPr>
+        <w:t>z_min</w:t>
+      </w:r>
+      <w:proofErr w:type="spellEnd"/>
+      <w:r>
+        <w:rPr>
+          <w:lang w:val="en-GB"/>
+        </w:rPr>
+        <w:t xml:space="preserve"> &gt; </w:t>
+      </w:r>
+      <w:proofErr w:type="spellStart"/>
+      <w:r>
+        <w:rPr>
+          <w:lang w:val="en-GB"/>
+        </w:rPr>
+        <w:t>waterlevel</w:t>
+      </w:r>
+      <w:proofErr w:type="spellEnd"/>
+      <w:r>
+        <w:rPr>
+          <w:lang w:val="en-GB"/>
+        </w:rPr>
+        <w:t xml:space="preserve"> THEN </w:t>
+      </w:r>
+      <w:proofErr w:type="spellStart"/>
+      <w:r>
+        <w:rPr>
+          <w:lang w:val="en-GB"/>
+        </w:rPr>
+        <w:t>errormessage_and_stop</w:t>
+      </w:r>
+      <w:proofErr w:type="spellEnd"/>
     </w:p>
     <w:p>
       <w:pPr>
@@ -290,6 +501,8 @@
           <w:numId w:val="1"/>
         </w:numPr>
         <w:rPr>
+          <w:b/>
+          <w:bCs/>
           <w:lang w:val="en-GB"/>
         </w:rPr>
       </w:pPr>
@@ -303,26 +516,83 @@
         <w:rPr>
           <w:lang w:val="en-GB"/>
         </w:rPr>
-        <w:t>Discharge and const_excess: why is the base value averaged over intake locations of all diffusors?</w:t>
+        <w:t>How important is "</w:t>
+      </w:r>
+      <w:proofErr w:type="spellStart"/>
+      <w:r>
+        <w:rPr>
+          <w:lang w:val="en-GB"/>
+        </w:rPr>
+        <w:t>check_mixed_source_sink</w:t>
+      </w:r>
+      <w:proofErr w:type="spellEnd"/>
+      <w:r>
+        <w:rPr>
+          <w:lang w:val="en-GB"/>
+        </w:rPr>
+        <w:t>"?</w:t>
       </w:r>
       <w:r>
         <w:rPr>
           <w:lang w:val="en-GB"/>
         </w:rPr>
         <w:br/>
+        <w:t xml:space="preserve">The refactoring we have in mind will disconnect the generation of all sources and </w:t>
       </w:r>
       <w:r>
         <w:rPr>
           <w:lang w:val="en-GB"/>
         </w:rPr>
         <w:lastRenderedPageBreak/>
+        <w:t xml:space="preserve">sinks from the FM-grid-awareness. </w:t>
+      </w:r>
+      <w:r>
+        <w:rPr>
+          <w:lang w:val="en-GB"/>
+        </w:rPr>
+        <w:br/>
+        <w:t>Is this mix check still needed?</w:t>
+      </w:r>
+      <w:r>
+        <w:rPr>
+          <w:lang w:val="en-GB"/>
+        </w:rPr>
+        <w:br/>
         <w:t xml:space="preserve">A: </w:t>
       </w:r>
       <w:r>
         <w:rPr>
           <w:lang w:val="en-GB"/>
         </w:rPr>
-        <w:t>That is wrong: the base value to use in case of const_excess is just the intake location of the current diffusor only.</w:t>
+        <w:t xml:space="preserve">We think it is ok to have sinks and sources in the same </w:t>
+      </w:r>
+      <w:proofErr w:type="spellStart"/>
+      <w:r>
+        <w:rPr>
+          <w:lang w:val="en-GB"/>
+        </w:rPr>
+        <w:t>cell+layer</w:t>
+      </w:r>
+      <w:proofErr w:type="spellEnd"/>
+      <w:r>
+        <w:rPr>
+          <w:lang w:val="en-GB"/>
+        </w:rPr>
+        <w:t xml:space="preserve">. It would indeed be useful to include a warning telling the user that some sinks and sources are projected in the same </w:t>
+      </w:r>
+      <w:proofErr w:type="spellStart"/>
+      <w:r>
+        <w:rPr>
+          <w:lang w:val="en-GB"/>
+        </w:rPr>
+        <w:t>cell+layer</w:t>
+      </w:r>
+      <w:proofErr w:type="spellEnd"/>
+      <w:r>
+        <w:rPr>
+          <w:lang w:val="en-GB"/>
+        </w:rPr>
+        <w:t>. If possible, it would be very interesting to have a warning like: “Note that 35% of your entrainment is defined in cells that also contain a source”. If that number is 1%, the user may not bother. If it is 90%, this should urge the user to improve the sinks/source locations.</w:t>
       </w:r>
     </w:p>
     <w:p>
@@ -345,14 +615,21 @@
         <w:rPr>
           <w:lang w:val="en-GB"/>
         </w:rPr>
-        <w:t>How does “changing config during computation” work?</w:t>
-      </w:r>
-      <w:r>
-        <w:rPr>
-          <w:lang w:val="en-GB"/>
-        </w:rPr>
-        <w:br/>
-        <w:t>Who changes the config: C-SUMO or the user?</w:t>
+        <w:t xml:space="preserve">Discharge and </w:t>
+      </w:r>
+      <w:proofErr w:type="spellStart"/>
+      <w:r>
+        <w:rPr>
+          <w:lang w:val="en-GB"/>
+        </w:rPr>
+        <w:t>const_excess</w:t>
+      </w:r>
+      <w:proofErr w:type="spellEnd"/>
+      <w:r>
+        <w:rPr>
+          <w:lang w:val="en-GB"/>
+        </w:rPr>
+        <w:t>: why is the base value averaged over intake locations of all diffusors?</w:t>
       </w:r>
       <w:r>
         <w:rPr>
@@ -365,14 +642,21 @@
         <w:rPr>
           <w:lang w:val="en-GB"/>
         </w:rPr>
-        <w:t>C-SUMO might do that in the future, for example in the following scenario:</w:t>
-      </w:r>
-      <w:r>
-        <w:rPr>
-          <w:lang w:val="en-GB"/>
-        </w:rPr>
-        <w:br/>
-        <w:t>During a computation, C-SUMO finds out that the locations of the ambient points are not optimal and changes them in the config file for the next computation.</w:t>
+        <w:t xml:space="preserve">That is wrong: the base value to use in case of </w:t>
+      </w:r>
+      <w:proofErr w:type="spellStart"/>
+      <w:r>
+        <w:rPr>
+          <w:lang w:val="en-GB"/>
+        </w:rPr>
+        <w:t>const_excess</w:t>
+      </w:r>
+      <w:proofErr w:type="spellEnd"/>
+      <w:r>
+        <w:rPr>
+          <w:lang w:val="en-GB"/>
+        </w:rPr>
+        <w:t xml:space="preserve"> is just the intake location of the current diffusor only.</w:t>
       </w:r>
     </w:p>
     <w:p>
@@ -395,7 +679,14 @@
         <w:rPr>
           <w:lang w:val="en-GB"/>
         </w:rPr>
-        <w:t>Why is density re-computed using temperature and salinity, while array “rho” is already available?</w:t>
+        <w:t>How does “changing config during computation” work?</w:t>
+      </w:r>
+      <w:r>
+        <w:rPr>
+          <w:lang w:val="en-GB"/>
+        </w:rPr>
+        <w:br/>
+        <w:t>Who changes the config: C-SUMO or the user?</w:t>
       </w:r>
       <w:r>
         <w:rPr>
@@ -408,13 +699,14 @@
         <w:rPr>
           <w:lang w:val="en-GB"/>
         </w:rPr>
-        <w:t>That is not needed: just use rho as computed by D-Flow FM.</w:t>
+        <w:t>C-SUMO might do that in the future, for example in the following scenario:</w:t>
       </w:r>
       <w:r>
         <w:rPr>
           <w:lang w:val="en-GB"/>
         </w:rPr>
         <w:br/>
+        <w:t>During a computation, C-SUMO finds out that the locations of the ambient points are not optimal and changes them in the config file for the next computation.</w:t>
       </w:r>
     </w:p>
     <w:p>
@@ -431,34 +723,32 @@
         <w:rPr>
           <w:lang w:val="en-GB"/>
         </w:rPr>
-        <w:t>Q: What is C-SUMO doing with the mdu-file?</w:t>
+        <w:t xml:space="preserve">Q: </w:t>
+      </w:r>
+      <w:r>
+        <w:rPr>
+          <w:lang w:val="en-GB"/>
+        </w:rPr>
+        <w:t>Why is density re-computed using temperature and salinity, while array “rho” is already available?</w:t>
       </w:r>
       <w:r>
         <w:rPr>
           <w:lang w:val="en-GB"/>
         </w:rPr>
         <w:br/>
-        <w:t>Why is the mdu-file specified in the FF2NF file?</w:t>
+        <w:t xml:space="preserve">A: </w:t>
+      </w:r>
+      <w:r>
+        <w:rPr>
+          <w:lang w:val="en-GB"/>
+        </w:rPr>
+        <w:t>That is not needed: just use rho as computed by D-Flow FM.</w:t>
       </w:r>
       <w:r>
         <w:rPr>
           <w:lang w:val="en-GB"/>
         </w:rPr>
         <w:br/>
-      </w:r>
-      <w:r>
-        <w:rPr>
-          <w:b/>
-          <w:bCs/>
-          <w:lang w:val="en-GB"/>
-        </w:rPr>
-        <w:t>A:</w:t>
-      </w:r>
-      <w:r>
-        <w:rPr>
-          <w:lang w:val="en-GB"/>
-        </w:rPr>
-        <w:t xml:space="preserve"> </w:t>
       </w:r>
     </w:p>
     <w:p>
@@ -475,50 +765,42 @@
         <w:rPr>
           <w:lang w:val="en-GB"/>
         </w:rPr>
-        <w:t xml:space="preserve">Q: </w:t>
-      </w:r>
-      <w:r>
-        <w:rPr>
-          <w:lang w:val="en-GB"/>
-        </w:rPr>
-        <w:t xml:space="preserve">Is it allowed that C-SUMO_preCICE </w:t>
-      </w:r>
-      <w:r>
-        <w:rPr>
-          <w:lang w:val="en-GB"/>
-        </w:rPr>
-        <w:t>uses/</w:t>
-      </w:r>
-      <w:r>
-        <w:rPr>
-          <w:lang w:val="en-GB"/>
-        </w:rPr>
-        <w:t xml:space="preserve">writes </w:t>
-      </w:r>
-      <w:r>
-        <w:rPr>
-          <w:lang w:val="en-GB"/>
-        </w:rPr>
-        <w:t>for t</w:t>
-      </w:r>
-      <w:r>
-        <w:rPr>
-          <w:lang w:val="en-GB"/>
-        </w:rPr>
-        <w:t xml:space="preserve">he </w:t>
-      </w:r>
-      <w:r>
-        <w:rPr>
-          <w:lang w:val="en-GB"/>
-        </w:rPr>
-        <w:t>constituent names: Temperature, Salinity, A, B, C, ...?</w:t>
+        <w:t xml:space="preserve">Q: What is C-SUMO doing with the </w:t>
+      </w:r>
+      <w:proofErr w:type="spellStart"/>
+      <w:r>
+        <w:rPr>
+          <w:lang w:val="en-GB"/>
+        </w:rPr>
+        <w:t>mdu</w:t>
+      </w:r>
+      <w:proofErr w:type="spellEnd"/>
+      <w:r>
+        <w:rPr>
+          <w:lang w:val="en-GB"/>
+        </w:rPr>
+        <w:t>-file?</w:t>
       </w:r>
       <w:r>
         <w:rPr>
           <w:lang w:val="en-GB"/>
         </w:rPr>
         <w:br/>
-        <w:t>Passing through the actual names of all constituents works a bit awkward with preCICE.</w:t>
+        <w:t xml:space="preserve">Why is the </w:t>
+      </w:r>
+      <w:proofErr w:type="spellStart"/>
+      <w:r>
+        <w:rPr>
+          <w:lang w:val="en-GB"/>
+        </w:rPr>
+        <w:t>mdu</w:t>
+      </w:r>
+      <w:proofErr w:type="spellEnd"/>
+      <w:r>
+        <w:rPr>
+          <w:lang w:val="en-GB"/>
+        </w:rPr>
+        <w:t>-file specified in the FF2NF file?</w:t>
       </w:r>
       <w:r>
         <w:rPr>
@@ -528,17 +810,43 @@
       </w:r>
       <w:r>
         <w:rPr>
-          <w:b/>
-          <w:bCs/>
-          <w:lang w:val="en-GB"/>
-        </w:rPr>
-        <w:t>A:</w:t>
-      </w:r>
-      <w:r>
-        <w:rPr>
-          <w:lang w:val="en-GB"/>
-        </w:rPr>
-        <w:t xml:space="preserve"> </w:t>
+          <w:lang w:val="en-GB"/>
+        </w:rPr>
+        <w:t xml:space="preserve">A: </w:t>
+      </w:r>
+      <w:r>
+        <w:rPr>
+          <w:lang w:val="en-GB"/>
+        </w:rPr>
+        <w:t>For most type of couplings, C-SUMO does not read the .</w:t>
+      </w:r>
+      <w:proofErr w:type="spellStart"/>
+      <w:r>
+        <w:rPr>
+          <w:lang w:val="en-GB"/>
+        </w:rPr>
+        <w:t>mdu</w:t>
+      </w:r>
+      <w:proofErr w:type="spellEnd"/>
+      <w:r>
+        <w:rPr>
+          <w:lang w:val="en-GB"/>
+        </w:rPr>
+        <w:t xml:space="preserve"> file. However, for some coupling types, C-SUMO does read the .</w:t>
+      </w:r>
+      <w:proofErr w:type="spellStart"/>
+      <w:r>
+        <w:rPr>
+          <w:lang w:val="en-GB"/>
+        </w:rPr>
+        <w:t>mdu</w:t>
+      </w:r>
+      <w:proofErr w:type="spellEnd"/>
+      <w:r>
+        <w:rPr>
+          <w:lang w:val="en-GB"/>
+        </w:rPr>
+        <w:t xml:space="preserve"> file for details like: simulations stop time, layer schematisation, etc.</w:t>
       </w:r>
     </w:p>
     <w:p>
@@ -561,13 +869,39 @@
         <w:rPr>
           <w:lang w:val="en-GB"/>
         </w:rPr>
-        <w:t xml:space="preserve">How important is it that C-SUMO uses </w:t>
-      </w:r>
-      <w:r>
-        <w:rPr>
-          <w:lang w:val="en-GB"/>
-        </w:rPr>
-        <w:t>t</w:t>
+        <w:t>Is it allowed that C-</w:t>
+      </w:r>
+      <w:proofErr w:type="spellStart"/>
+      <w:r>
+        <w:rPr>
+          <w:lang w:val="en-GB"/>
+        </w:rPr>
+        <w:t>SUMO_preCICE</w:t>
+      </w:r>
+      <w:proofErr w:type="spellEnd"/>
+      <w:r>
+        <w:rPr>
+          <w:lang w:val="en-GB"/>
+        </w:rPr>
+        <w:t xml:space="preserve"> </w:t>
+      </w:r>
+      <w:r>
+        <w:rPr>
+          <w:lang w:val="en-GB"/>
+        </w:rPr>
+        <w:t>uses/</w:t>
+      </w:r>
+      <w:r>
+        <w:rPr>
+          <w:lang w:val="en-GB"/>
+        </w:rPr>
+        <w:t xml:space="preserve">writes </w:t>
+      </w:r>
+      <w:r>
+        <w:rPr>
+          <w:lang w:val="en-GB"/>
+        </w:rPr>
+        <w:t>for t</w:t>
       </w:r>
       <w:r>
         <w:rPr>
@@ -579,109 +913,28 @@
         <w:rPr>
           <w:lang w:val="en-GB"/>
         </w:rPr>
-        <w:t xml:space="preserve">exact </w:t>
-      </w:r>
-      <w:r>
-        <w:rPr>
-          <w:lang w:val="en-GB"/>
-        </w:rPr>
-        <w:t xml:space="preserve">z-locations from </w:t>
-      </w:r>
-      <w:r>
-        <w:rPr>
-          <w:lang w:val="en-GB"/>
-        </w:rPr>
-        <w:t xml:space="preserve">D-Flow </w:t>
-      </w:r>
-      <w:r>
-        <w:rPr>
-          <w:lang w:val="en-GB"/>
-        </w:rPr>
-        <w:t xml:space="preserve">FM? </w:t>
-      </w:r>
-      <w:r>
-        <w:rPr>
-          <w:lang w:val="en-GB"/>
-        </w:rPr>
-        <w:t xml:space="preserve">Currently, </w:t>
-      </w:r>
-      <w:r>
-        <w:rPr>
-          <w:lang w:val="en-GB"/>
-        </w:rPr>
-        <w:t xml:space="preserve">quantities are defined at the exact vertical locations of the D-Flow FM grid so no vertical interpolation is needed. The </w:t>
-      </w:r>
-      <w:r>
-        <w:rPr>
-          <w:lang w:val="en-GB"/>
-        </w:rPr>
-        <w:t>Proposal</w:t>
-      </w:r>
-      <w:r>
-        <w:rPr>
-          <w:lang w:val="en-GB"/>
-        </w:rPr>
-        <w:t xml:space="preserve"> is that the</w:t>
-      </w:r>
-      <w:r>
-        <w:rPr>
-          <w:lang w:val="en-GB"/>
-        </w:rPr>
-        <w:t xml:space="preserve"> C-SUMO config file contains </w:t>
-      </w:r>
-      <w:r>
-        <w:rPr>
-          <w:lang w:val="en-GB"/>
-        </w:rPr>
-        <w:t xml:space="preserve">an integer specifying the </w:t>
-      </w:r>
-      <w:r>
-        <w:rPr>
-          <w:lang w:val="en-GB"/>
-        </w:rPr>
-        <w:t xml:space="preserve">number of equidistant z-locations </w:t>
-      </w:r>
-      <w:r>
-        <w:rPr>
-          <w:lang w:val="en-GB"/>
-        </w:rPr>
-        <w:t xml:space="preserve">for all points of interest. The </w:t>
-      </w:r>
-      <w:r>
-        <w:rPr>
-          <w:lang w:val="en-GB"/>
-        </w:rPr>
-        <w:t>advantage</w:t>
-      </w:r>
-      <w:r>
-        <w:rPr>
-          <w:lang w:val="en-GB"/>
-        </w:rPr>
-        <w:t xml:space="preserve"> is that </w:t>
-      </w:r>
-      <w:r>
-        <w:rPr>
-          <w:lang w:val="en-GB"/>
-        </w:rPr>
-        <w:t xml:space="preserve">preCICE </w:t>
-      </w:r>
-      <w:r>
-        <w:rPr>
-          <w:lang w:val="en-GB"/>
-        </w:rPr>
-        <w:t xml:space="preserve">can do the </w:t>
-      </w:r>
-      <w:r>
-        <w:rPr>
-          <w:lang w:val="en-GB"/>
-        </w:rPr>
-        <w:t>3D interpolation</w:t>
-      </w:r>
-      <w:r>
-        <w:rPr>
-          <w:lang w:val="en-GB"/>
-        </w:rPr>
-        <w:t xml:space="preserve"> from the D-Flow FM grid to these xyz-locations.</w:t>
+        <w:t>constituent names: Temperature, Salinity, A, B, C, ...?</w:t>
+      </w:r>
+      <w:r>
+        <w:rPr>
+          <w:lang w:val="en-GB"/>
+        </w:rPr>
+        <w:br/>
+        <w:t xml:space="preserve">Passing through the actual names of all constituents works a bit awkward with </w:t>
+      </w:r>
+      <w:proofErr w:type="spellStart"/>
+      <w:r>
+        <w:rPr>
+          <w:lang w:val="en-GB"/>
+        </w:rPr>
+        <w:t>preCICE</w:t>
+      </w:r>
+      <w:proofErr w:type="spellEnd"/>
+      <w:r>
+        <w:rPr>
+          <w:lang w:val="en-GB"/>
+        </w:rPr>
+        <w:t>.</w:t>
       </w:r>
       <w:r>
         <w:rPr>
@@ -695,7 +948,21 @@
           <w:bCs/>
           <w:lang w:val="en-GB"/>
         </w:rPr>
-        <w:t xml:space="preserve">A: </w:t>
+        <w:t>A:</w:t>
+      </w:r>
+      <w:r>
+        <w:rPr>
+          <w:lang w:val="en-GB"/>
+        </w:rPr>
+        <w:t xml:space="preserve"> </w:t>
+      </w:r>
+      <w:r>
+        <w:rPr>
+          <w:b/>
+          <w:bCs/>
+          <w:lang w:val="en-GB"/>
+        </w:rPr>
+        <w:t>More background needed</w:t>
       </w:r>
     </w:p>
     <w:p>
@@ -718,6 +985,196 @@
         <w:rPr>
           <w:lang w:val="en-GB"/>
         </w:rPr>
+        <w:t xml:space="preserve">How important is it that C-SUMO uses </w:t>
+      </w:r>
+      <w:r>
+        <w:rPr>
+          <w:lang w:val="en-GB"/>
+        </w:rPr>
+        <w:t>t</w:t>
+      </w:r>
+      <w:r>
+        <w:rPr>
+          <w:lang w:val="en-GB"/>
+        </w:rPr>
+        <w:t xml:space="preserve">he </w:t>
+      </w:r>
+      <w:r>
+        <w:rPr>
+          <w:lang w:val="en-GB"/>
+        </w:rPr>
+        <w:t xml:space="preserve">exact </w:t>
+      </w:r>
+      <w:r>
+        <w:rPr>
+          <w:lang w:val="en-GB"/>
+        </w:rPr>
+        <w:t xml:space="preserve">z-locations from </w:t>
+      </w:r>
+      <w:r>
+        <w:rPr>
+          <w:lang w:val="en-GB"/>
+        </w:rPr>
+        <w:t xml:space="preserve">D-Flow </w:t>
+      </w:r>
+      <w:r>
+        <w:rPr>
+          <w:lang w:val="en-GB"/>
+        </w:rPr>
+        <w:t xml:space="preserve">FM? </w:t>
+      </w:r>
+      <w:r>
+        <w:rPr>
+          <w:lang w:val="en-GB"/>
+        </w:rPr>
+        <w:t xml:space="preserve">Currently, </w:t>
+      </w:r>
+      <w:r>
+        <w:rPr>
+          <w:lang w:val="en-GB"/>
+        </w:rPr>
+        <w:t xml:space="preserve">quantities are defined at the exact vertical locations of the D-Flow FM grid so no vertical interpolation is needed. The </w:t>
+      </w:r>
+      <w:r>
+        <w:rPr>
+          <w:lang w:val="en-GB"/>
+        </w:rPr>
+        <w:t>Proposal</w:t>
+      </w:r>
+      <w:r>
+        <w:rPr>
+          <w:lang w:val="en-GB"/>
+        </w:rPr>
+        <w:t xml:space="preserve"> is that the</w:t>
+      </w:r>
+      <w:r>
+        <w:rPr>
+          <w:lang w:val="en-GB"/>
+        </w:rPr>
+        <w:t xml:space="preserve"> C-SUMO config file contains </w:t>
+      </w:r>
+      <w:r>
+        <w:rPr>
+          <w:lang w:val="en-GB"/>
+        </w:rPr>
+        <w:t xml:space="preserve">an integer specifying the </w:t>
+      </w:r>
+      <w:r>
+        <w:rPr>
+          <w:lang w:val="en-GB"/>
+        </w:rPr>
+        <w:t xml:space="preserve">number of equidistant z-locations </w:t>
+      </w:r>
+      <w:r>
+        <w:rPr>
+          <w:lang w:val="en-GB"/>
+        </w:rPr>
+        <w:t xml:space="preserve">for all points of interest. The </w:t>
+      </w:r>
+      <w:r>
+        <w:rPr>
+          <w:lang w:val="en-GB"/>
+        </w:rPr>
+        <w:t>advantage</w:t>
+      </w:r>
+      <w:r>
+        <w:rPr>
+          <w:lang w:val="en-GB"/>
+        </w:rPr>
+        <w:t xml:space="preserve"> is that </w:t>
+      </w:r>
+      <w:proofErr w:type="spellStart"/>
+      <w:r>
+        <w:rPr>
+          <w:lang w:val="en-GB"/>
+        </w:rPr>
+        <w:t>preCICE</w:t>
+      </w:r>
+      <w:proofErr w:type="spellEnd"/>
+      <w:r>
+        <w:rPr>
+          <w:lang w:val="en-GB"/>
+        </w:rPr>
+        <w:t xml:space="preserve"> </w:t>
+      </w:r>
+      <w:r>
+        <w:rPr>
+          <w:lang w:val="en-GB"/>
+        </w:rPr>
+        <w:t xml:space="preserve">can do the </w:t>
+      </w:r>
+      <w:r>
+        <w:rPr>
+          <w:lang w:val="en-GB"/>
+        </w:rPr>
+        <w:t xml:space="preserve">3D </w:t>
+      </w:r>
+      <w:r>
+        <w:rPr>
+          <w:lang w:val="en-GB"/>
+        </w:rPr>
+        <w:lastRenderedPageBreak/>
+        <w:t>interpolation</w:t>
+      </w:r>
+      <w:r>
+        <w:rPr>
+          <w:lang w:val="en-GB"/>
+        </w:rPr>
+        <w:t xml:space="preserve"> from the D-Flow FM grid to these </w:t>
+      </w:r>
+      <w:proofErr w:type="spellStart"/>
+      <w:r>
+        <w:rPr>
+          <w:lang w:val="en-GB"/>
+        </w:rPr>
+        <w:t>xyz</w:t>
+      </w:r>
+      <w:proofErr w:type="spellEnd"/>
+      <w:r>
+        <w:rPr>
+          <w:lang w:val="en-GB"/>
+        </w:rPr>
+        <w:t>-locations.</w:t>
+      </w:r>
+      <w:r>
+        <w:rPr>
+          <w:lang w:val="en-GB"/>
+        </w:rPr>
+        <w:br/>
+      </w:r>
+      <w:r>
+        <w:rPr>
+          <w:lang w:val="en-GB"/>
+        </w:rPr>
+        <w:t xml:space="preserve">A: </w:t>
+      </w:r>
+      <w:r>
+        <w:rPr>
+          <w:lang w:val="en-GB"/>
+        </w:rPr>
+        <w:t>Are we talking about the vertical levels as specified in the FF2NF*.xml file? Preferably we would like to have the temperature, salinity, etc. for each model layer. The disadvantage of resampling is that we might lose some detail in the FF2NF*.xml file. This could happen when you are using a Z-sigma layering approach with thin layers near the surface and very thick layers in deeper waters.</w:t>
+      </w:r>
+    </w:p>
+    <w:p>
+      <w:pPr>
+        <w:numPr>
+          <w:ilvl w:val="0"/>
+          <w:numId w:val="1"/>
+        </w:numPr>
+        <w:rPr>
+          <w:lang w:val="en-GB"/>
+        </w:rPr>
+      </w:pPr>
+      <w:r>
+        <w:rPr>
+          <w:lang w:val="en-GB"/>
+        </w:rPr>
+        <w:t xml:space="preserve">Q: </w:t>
+      </w:r>
+      <w:r>
+        <w:rPr>
+          <w:lang w:val="en-GB"/>
+        </w:rPr>
         <w:t>Where is the DESA routine located</w:t>
       </w:r>
       <w:r>
@@ -741,11 +1198,35 @@
       </w:r>
       <w:r>
         <w:rPr>
-          <w:b/>
-          <w:bCs/>
           <w:lang w:val="en-GB"/>
         </w:rPr>
         <w:t>A:</w:t>
+      </w:r>
+      <w:r>
+        <w:rPr>
+          <w:lang w:val="en-GB"/>
+        </w:rPr>
+        <w:t xml:space="preserve"> </w:t>
+      </w:r>
+      <w:r>
+        <w:rPr>
+          <w:lang w:val="en-GB"/>
+        </w:rPr>
+        <w:t xml:space="preserve">The DESA routine is located inside Delft3D4 and D-FLOW FM. The NF2FF*.xml file (generated by C-SUMO) contains the coordinates of the sinks and sources as well as the dilution for each sink location. The </w:t>
+      </w:r>
+      <w:proofErr w:type="spellStart"/>
+      <w:r>
+        <w:rPr>
+          <w:lang w:val="en-GB"/>
+        </w:rPr>
+        <w:t>desa</w:t>
+      </w:r>
+      <w:proofErr w:type="spellEnd"/>
+      <w:r>
+        <w:rPr>
+          <w:lang w:val="en-GB"/>
+        </w:rPr>
+        <w:t xml:space="preserve"> routine inside Delft3D4/FM converts this into extractions and discharges.</w:t>
       </w:r>
     </w:p>
     <w:p>
@@ -788,12 +1269,20 @@
           <w:lang w:val="en-GB"/>
         </w:rPr>
       </w:pPr>
+      <w:proofErr w:type="spellStart"/>
       <w:r>
         <w:rPr>
           <w:lang w:val="en-GB"/>
         </w:rPr>
         <w:lastRenderedPageBreak/>
-        <w:t>QandA Arthur</w:t>
+        <w:t>QandA</w:t>
+      </w:r>
+      <w:proofErr w:type="spellEnd"/>
+      <w:r>
+        <w:rPr>
+          <w:lang w:val="en-GB"/>
+        </w:rPr>
+        <w:t xml:space="preserve"> Arthur</w:t>
       </w:r>
     </w:p>
     <w:p>
@@ -1008,11 +1497,19 @@
           <w:lang w:val="en-GB"/>
         </w:rPr>
       </w:pPr>
-      <w:r>
-        <w:rPr>
-          <w:lang w:val="en-GB"/>
-        </w:rPr>
-        <w:t>QandA SEA-team</w:t>
+      <w:proofErr w:type="spellStart"/>
+      <w:r>
+        <w:rPr>
+          <w:lang w:val="en-GB"/>
+        </w:rPr>
+        <w:t>QandA</w:t>
+      </w:r>
+      <w:proofErr w:type="spellEnd"/>
+      <w:r>
+        <w:rPr>
+          <w:lang w:val="en-GB"/>
+        </w:rPr>
+        <w:t xml:space="preserve"> SEA-team</w:t>
       </w:r>
     </w:p>
     <w:p>
@@ -1062,7 +1559,21 @@
           <w:lang w:val="en-GB"/>
         </w:rPr>
         <w:br/>
-        <w:t>A: In C-SUMO_preCICE, use the following standard names for the constituents:</w:t>
+        <w:t>A: In C-</w:t>
+      </w:r>
+      <w:proofErr w:type="spellStart"/>
+      <w:r>
+        <w:rPr>
+          <w:lang w:val="en-GB"/>
+        </w:rPr>
+        <w:t>SUMO_preCICE</w:t>
+      </w:r>
+      <w:proofErr w:type="spellEnd"/>
+      <w:r>
+        <w:rPr>
+          <w:lang w:val="en-GB"/>
+        </w:rPr>
+        <w:t>, use the following standard names for the constituents:</w:t>
       </w:r>
       <w:r>
         <w:rPr>
@@ -1086,7 +1597,35 @@
         <w:rPr>
           <w:lang w:val="en-GB"/>
         </w:rPr>
-        <w:t>Q: Handle below bedlevel, above waterlevel correctly</w:t>
+        <w:t xml:space="preserve">Q: Handle below </w:t>
+      </w:r>
+      <w:proofErr w:type="spellStart"/>
+      <w:r>
+        <w:rPr>
+          <w:lang w:val="en-GB"/>
+        </w:rPr>
+        <w:t>bedlevel</w:t>
+      </w:r>
+      <w:proofErr w:type="spellEnd"/>
+      <w:r>
+        <w:rPr>
+          <w:lang w:val="en-GB"/>
+        </w:rPr>
+        <w:t xml:space="preserve">, above </w:t>
+      </w:r>
+      <w:proofErr w:type="spellStart"/>
+      <w:r>
+        <w:rPr>
+          <w:lang w:val="en-GB"/>
+        </w:rPr>
+        <w:t>waterlevel</w:t>
+      </w:r>
+      <w:proofErr w:type="spellEnd"/>
+      <w:r>
+        <w:rPr>
+          <w:lang w:val="en-GB"/>
+        </w:rPr>
+        <w:t xml:space="preserve"> correctly</w:t>
       </w:r>
     </w:p>
     <w:p>
@@ -1118,7 +1657,35 @@
         <w:rPr>
           <w:lang w:val="en-GB"/>
         </w:rPr>
-        <w:t>Key point is that we aim on refactoring the communication from C-SUMO_precice to D-Flow FM. The goal is to make the data being transferred independent of the D-Flow FM grid (mapping to the grid should happen inside D-Flow FM) and independent of the diffusor geometry (data entering D-Flow FM should just be a cloud of source/sink points). As a result, the routines related to DESA should be moved from D-Flow FM to C-SUMO_precice.</w:t>
+        <w:t>Key point is that we aim on refactoring the communication from C-</w:t>
+      </w:r>
+      <w:proofErr w:type="spellStart"/>
+      <w:r>
+        <w:rPr>
+          <w:lang w:val="en-GB"/>
+        </w:rPr>
+        <w:t>SUMO_precice</w:t>
+      </w:r>
+      <w:proofErr w:type="spellEnd"/>
+      <w:r>
+        <w:rPr>
+          <w:lang w:val="en-GB"/>
+        </w:rPr>
+        <w:t xml:space="preserve"> to D-Flow FM. The goal is to make the data being transferred independent of the D-Flow FM grid (mapping to the grid should happen inside D-Flow FM) and independent of the diffusor geometry (data entering D-Flow FM should just be a cloud of source/sink points). As a result, the routines related to DESA should be moved from D-Flow FM to C-</w:t>
+      </w:r>
+      <w:proofErr w:type="spellStart"/>
+      <w:r>
+        <w:rPr>
+          <w:lang w:val="en-GB"/>
+        </w:rPr>
+        <w:t>SUMO_precice</w:t>
+      </w:r>
+      <w:proofErr w:type="spellEnd"/>
+      <w:r>
+        <w:rPr>
+          <w:lang w:val="en-GB"/>
+        </w:rPr>
+        <w:t>.</w:t>
       </w:r>
     </w:p>
     <w:p>
@@ -1132,11 +1699,19 @@
           <w:lang w:val="en-GB"/>
         </w:rPr>
       </w:pPr>
-      <w:r>
-        <w:rPr>
-          <w:lang w:val="en-GB"/>
-        </w:rPr>
-        <w:t>PreCICE can only transfer real-type data on “a” grid</w:t>
+      <w:proofErr w:type="spellStart"/>
+      <w:r>
+        <w:rPr>
+          <w:lang w:val="en-GB"/>
+        </w:rPr>
+        <w:t>PreCICE</w:t>
+      </w:r>
+      <w:proofErr w:type="spellEnd"/>
+      <w:r>
+        <w:rPr>
+          <w:lang w:val="en-GB"/>
+        </w:rPr>
+        <w:t xml:space="preserve"> can only transfer real-type data on “a” grid</w:t>
       </w:r>
     </w:p>
     <w:p>
@@ -1154,7 +1729,35 @@
         <w:rPr>
           <w:lang w:val="en-GB"/>
         </w:rPr>
-        <w:t xml:space="preserve">Handle below bedlevel, above waterlevel correctly: handle on </w:t>
+        <w:t xml:space="preserve">Handle below </w:t>
+      </w:r>
+      <w:proofErr w:type="spellStart"/>
+      <w:r>
+        <w:rPr>
+          <w:lang w:val="en-GB"/>
+        </w:rPr>
+        <w:t>bedlevel</w:t>
+      </w:r>
+      <w:proofErr w:type="spellEnd"/>
+      <w:r>
+        <w:rPr>
+          <w:lang w:val="en-GB"/>
+        </w:rPr>
+        <w:t xml:space="preserve">, above </w:t>
+      </w:r>
+      <w:proofErr w:type="spellStart"/>
+      <w:r>
+        <w:rPr>
+          <w:lang w:val="en-GB"/>
+        </w:rPr>
+        <w:t>waterlevel</w:t>
+      </w:r>
+      <w:proofErr w:type="spellEnd"/>
+      <w:r>
+        <w:rPr>
+          <w:lang w:val="en-GB"/>
+        </w:rPr>
+        <w:t xml:space="preserve"> correctly: handle on </w:t>
       </w:r>
       <w:r>
         <w:rPr>
@@ -1220,7 +1823,35 @@
         <w:rPr>
           <w:lang w:val="en-GB"/>
         </w:rPr>
-        <w:t>Vertically outside the domain (above waterlevel or below bedlevel)</w:t>
+        <w:t xml:space="preserve">Vertically outside the domain (above </w:t>
+      </w:r>
+      <w:proofErr w:type="spellStart"/>
+      <w:r>
+        <w:rPr>
+          <w:lang w:val="en-GB"/>
+        </w:rPr>
+        <w:t>waterlevel</w:t>
+      </w:r>
+      <w:proofErr w:type="spellEnd"/>
+      <w:r>
+        <w:rPr>
+          <w:lang w:val="en-GB"/>
+        </w:rPr>
+        <w:t xml:space="preserve"> or below </w:t>
+      </w:r>
+      <w:proofErr w:type="spellStart"/>
+      <w:r>
+        <w:rPr>
+          <w:lang w:val="en-GB"/>
+        </w:rPr>
+        <w:t>bedlevel</w:t>
+      </w:r>
+      <w:proofErr w:type="spellEnd"/>
+      <w:r>
+        <w:rPr>
+          <w:lang w:val="en-GB"/>
+        </w:rPr>
+        <w:t>)</w:t>
       </w:r>
     </w:p>
     <w:p>
@@ -1264,11 +1895,19 @@
         </w:rPr>
         <w:t xml:space="preserve">use </w:t>
       </w:r>
-      <w:r>
-        <w:rPr>
-          <w:lang w:val="en-GB"/>
-        </w:rPr>
-        <w:t>mpi reduce</w:t>
+      <w:proofErr w:type="spellStart"/>
+      <w:r>
+        <w:rPr>
+          <w:lang w:val="en-GB"/>
+        </w:rPr>
+        <w:t>mpi</w:t>
+      </w:r>
+      <w:proofErr w:type="spellEnd"/>
+      <w:r>
+        <w:rPr>
+          <w:lang w:val="en-GB"/>
+        </w:rPr>
+        <w:t xml:space="preserve"> reduce</w:t>
       </w:r>
       <w:r>
         <w:rPr>
@@ -1298,7 +1937,21 @@
         <w:rPr>
           <w:lang w:val="en-GB"/>
         </w:rPr>
-        <w:t xml:space="preserve">How to interpolate FM data to the C-SUMO “grid”: preCICE interpolation 3D </w:t>
+        <w:t xml:space="preserve">How to interpolate FM data to the C-SUMO “grid”: </w:t>
+      </w:r>
+      <w:proofErr w:type="spellStart"/>
+      <w:r>
+        <w:rPr>
+          <w:lang w:val="en-GB"/>
+        </w:rPr>
+        <w:t>preCICE</w:t>
+      </w:r>
+      <w:proofErr w:type="spellEnd"/>
+      <w:r>
+        <w:rPr>
+          <w:lang w:val="en-GB"/>
+        </w:rPr>
+        <w:t xml:space="preserve"> interpolation 3D </w:t>
       </w:r>
     </w:p>
     <w:sectPr>
@@ -1798,6 +2451,92 @@
     </w:lvl>
   </w:abstractNum>
   <w:abstractNum w:abstractNumId="5" w15:restartNumberingAfterBreak="0">
+    <w:nsid w:val="5D8E4C36"/>
+    <w:multiLevelType w:val="hybridMultilevel"/>
+    <w:tmpl w:val="38800100"/>
+    <w:lvl w:ilvl="0" w:tplc="0413000F">
+      <w:start w:val="1"/>
+      <w:numFmt w:val="decimal"/>
+      <w:lvlText w:val="%1."/>
+      <w:lvlJc w:val="left"/>
+      <w:pPr>
+        <w:ind w:left="720" w:hanging="360"/>
+      </w:pPr>
+    </w:lvl>
+    <w:lvl w:ilvl="1" w:tplc="04130019">
+      <w:start w:val="1"/>
+      <w:numFmt w:val="lowerLetter"/>
+      <w:lvlText w:val="%2."/>
+      <w:lvlJc w:val="left"/>
+      <w:pPr>
+        <w:ind w:left="1440" w:hanging="360"/>
+      </w:pPr>
+    </w:lvl>
+    <w:lvl w:ilvl="2" w:tplc="0413001B">
+      <w:start w:val="1"/>
+      <w:numFmt w:val="lowerRoman"/>
+      <w:lvlText w:val="%3."/>
+      <w:lvlJc w:val="right"/>
+      <w:pPr>
+        <w:ind w:left="2160" w:hanging="180"/>
+      </w:pPr>
+    </w:lvl>
+    <w:lvl w:ilvl="3" w:tplc="0413000F">
+      <w:start w:val="1"/>
+      <w:numFmt w:val="decimal"/>
+      <w:lvlText w:val="%4."/>
+      <w:lvlJc w:val="left"/>
+      <w:pPr>
+        <w:ind w:left="2880" w:hanging="360"/>
+      </w:pPr>
+    </w:lvl>
+    <w:lvl w:ilvl="4" w:tplc="04130019">
+      <w:start w:val="1"/>
+      <w:numFmt w:val="lowerLetter"/>
+      <w:lvlText w:val="%5."/>
+      <w:lvlJc w:val="left"/>
+      <w:pPr>
+        <w:ind w:left="3600" w:hanging="360"/>
+      </w:pPr>
+    </w:lvl>
+    <w:lvl w:ilvl="5" w:tplc="0413001B">
+      <w:start w:val="1"/>
+      <w:numFmt w:val="lowerRoman"/>
+      <w:lvlText w:val="%6."/>
+      <w:lvlJc w:val="right"/>
+      <w:pPr>
+        <w:ind w:left="4320" w:hanging="180"/>
+      </w:pPr>
+    </w:lvl>
+    <w:lvl w:ilvl="6" w:tplc="0413000F">
+      <w:start w:val="1"/>
+      <w:numFmt w:val="decimal"/>
+      <w:lvlText w:val="%7."/>
+      <w:lvlJc w:val="left"/>
+      <w:pPr>
+        <w:ind w:left="5040" w:hanging="360"/>
+      </w:pPr>
+    </w:lvl>
+    <w:lvl w:ilvl="7" w:tplc="04130019">
+      <w:start w:val="1"/>
+      <w:numFmt w:val="lowerLetter"/>
+      <w:lvlText w:val="%8."/>
+      <w:lvlJc w:val="left"/>
+      <w:pPr>
+        <w:ind w:left="5760" w:hanging="360"/>
+      </w:pPr>
+    </w:lvl>
+    <w:lvl w:ilvl="8" w:tplc="0413001B">
+      <w:start w:val="1"/>
+      <w:numFmt w:val="lowerRoman"/>
+      <w:lvlText w:val="%9."/>
+      <w:lvlJc w:val="right"/>
+      <w:pPr>
+        <w:ind w:left="6480" w:hanging="180"/>
+      </w:pPr>
+    </w:lvl>
+  </w:abstractNum>
+  <w:abstractNum w:abstractNumId="6" w15:restartNumberingAfterBreak="0">
     <w:nsid w:val="660C3624"/>
     <w:multiLevelType w:val="multilevel"/>
     <w:tmpl w:val="8A00C328"/>
@@ -1977,7 +2716,7 @@
     <w:abstractNumId w:val="4"/>
   </w:num>
   <w:num w:numId="5" w16cid:durableId="20327157">
-    <w:abstractNumId w:val="5"/>
+    <w:abstractNumId w:val="6"/>
     <w:lvlOverride w:ilvl="0">
       <w:startOverride w:val="1"/>
     </w:lvlOverride>
@@ -2011,6 +2750,36 @@
   </w:num>
   <w:num w:numId="7" w16cid:durableId="1500269734">
     <w:abstractNumId w:val="2"/>
+    <w:lvlOverride w:ilvl="0">
+      <w:startOverride w:val="1"/>
+    </w:lvlOverride>
+    <w:lvlOverride w:ilvl="1">
+      <w:startOverride w:val="1"/>
+    </w:lvlOverride>
+    <w:lvlOverride w:ilvl="2">
+      <w:startOverride w:val="1"/>
+    </w:lvlOverride>
+    <w:lvlOverride w:ilvl="3">
+      <w:startOverride w:val="1"/>
+    </w:lvlOverride>
+    <w:lvlOverride w:ilvl="4">
+      <w:startOverride w:val="1"/>
+    </w:lvlOverride>
+    <w:lvlOverride w:ilvl="5">
+      <w:startOverride w:val="1"/>
+    </w:lvlOverride>
+    <w:lvlOverride w:ilvl="6">
+      <w:startOverride w:val="1"/>
+    </w:lvlOverride>
+    <w:lvlOverride w:ilvl="7">
+      <w:startOverride w:val="1"/>
+    </w:lvlOverride>
+    <w:lvlOverride w:ilvl="8">
+      <w:startOverride w:val="1"/>
+    </w:lvlOverride>
+  </w:num>
+  <w:num w:numId="8" w16cid:durableId="1083842342">
+    <w:abstractNumId w:val="5"/>
     <w:lvlOverride w:ilvl="0">
       <w:startOverride w:val="1"/>
     </w:lvlOverride>

</xml_diff>